<commit_message>
Schritt 7: Probearbeit und drei vergleichbare Prüfungen mit einheitlichen Papierhilfen
</commit_message>
<xml_diff>
--- a/materialien/probearbeit/Probearbeit_Wunschbrief_Komplettpaket.docx
+++ b/materialien/probearbeit/Probearbeit_Wunschbrief_Komplettpaket.docx
@@ -4,68 +4,342 @@
   <w:body>
     <w:p>
       <w:pPr>
-        <w:spacing w:after="40"/>
-        <w:jc w:val="center"/>
+        <w:pStyle w:val="ExamTitle"/>
+        <w:pageBreakBefore w:val="0"/>
       </w:pPr>
       <w:r>
-        <w:rPr>
-          <w:b/>
-          <w:color w:val="3E5668"/>
-          <w:sz w:val="42"/>
-        </w:rPr>
-        <w:t>Probearbeit: Wunschbrief für unsere Lernumgebung</w:t>
+        <w:t>Probearbeit · Dein Wunschbrief</w:t>
       </w:r>
     </w:p>
     <w:p>
       <w:pPr>
-        <w:spacing w:after="100"/>
-        <w:jc w:val="center"/>
+        <w:pStyle w:val="ExamBody"/>
       </w:pPr>
       <w:r>
-        <w:rPr>
-          <w:i/>
-          <w:color w:val="D97A4A"/>
-          <w:sz w:val="20"/>
-        </w:rPr>
-        <w:t>Lehrkraftüberblick · Deutsch 5 · SRL</w:t>
+        <w:t>Name: __________________________  Datum: ______________</w:t>
+      </w:r>
+    </w:p>
+    <w:p>
+      <w:pPr>
+        <w:pStyle w:val="ExamBody"/>
+      </w:pPr>
+      <w:r>
+        <w:t>Arbeitszeit: ______ Minuten · Die Lehrkraft trägt die Zeit ein.</w:t>
+      </w:r>
+    </w:p>
+    <w:p>
+      <w:pPr>
+        <w:pStyle w:val="ExamHeading"/>
+      </w:pPr>
+      <w:r>
+        <w:t>Deine Situation</w:t>
+      </w:r>
+    </w:p>
+    <w:p>
+      <w:pPr>
+        <w:pStyle w:val="ExamBody"/>
+      </w:pPr>
+      <w:r>
+        <w:t>Die Schulleitung sammelt Wünsche für den Schulalltag. Schreibe ihr einen Brief. Dein Wunsch ist: Ablagefächer für unseren Klassenraum.</w:t>
+      </w:r>
+    </w:p>
+    <w:p>
+      <w:pPr>
+        <w:pStyle w:val="ExamHeading"/>
+      </w:pPr>
+      <w:r>
+        <w:t>Dein Auftrag</w:t>
+      </w:r>
+    </w:p>
+    <w:p>
+      <w:pPr>
+        <w:pStyle w:val="ExamBody"/>
+      </w:pPr>
+      <w:r>
+        <w:t>☐ Schreibe Ort und Datum oben auf den Brief.</w:t>
+      </w:r>
+    </w:p>
+    <w:p>
+      <w:pPr>
+        <w:pStyle w:val="ExamBody"/>
+      </w:pPr>
+      <w:r>
+        <w:t>☐ Wähle eine passende Anrede für die Schulleitung.</w:t>
+      </w:r>
+    </w:p>
+    <w:p>
+      <w:pPr>
+        <w:pStyle w:val="ExamBody"/>
+      </w:pPr>
+      <w:r>
+        <w:t>☐ Formuliere den vorgegebenen Wunsch klar und freundlich.</w:t>
+      </w:r>
+    </w:p>
+    <w:p>
+      <w:pPr>
+        <w:pStyle w:val="ExamBody"/>
+      </w:pPr>
+      <w:r>
+        <w:t>☐ Schreibe mindestens einen weiteren passenden Satz.</w:t>
+      </w:r>
+    </w:p>
+    <w:p>
+      <w:pPr>
+        <w:pStyle w:val="ExamBody"/>
+      </w:pPr>
+      <w:r>
+        <w:t>☐ Beende den Brief mit einer Grußformel und deinem Namen.</w:t>
+      </w:r>
+    </w:p>
+    <w:p>
+      <w:pPr>
+        <w:pStyle w:val="ExamBody"/>
+      </w:pPr>
+      <w:r>
+        <w:t>☐ Schreibe ganze Sätze und so, dass man deine Schrift lesen kann.</w:t>
+      </w:r>
+    </w:p>
+    <w:p>
+      <w:pPr>
+        <w:pStyle w:val="ExamHeading"/>
+      </w:pPr>
+      <w:r>
+        <w:t>Zusätze · freiwillig</w:t>
+      </w:r>
+    </w:p>
+    <w:p>
+      <w:pPr>
+        <w:pStyle w:val="ExamBody"/>
+      </w:pPr>
+      <w:r>
+        <w:t>Du kannst einen sachlichen Grund und/oder ein passendes Umfrageergebnis ergänzen. Beides darfst du weglassen.</w:t>
+      </w:r>
+    </w:p>
+    <w:p>
+      <w:pPr>
+        <w:pStyle w:val="ExamHeading"/>
+      </w:pPr>
+      <w:r>
+        <w:t>Beispielumfrage · nur für den freiwilligen Zusatz</w:t>
+      </w:r>
+    </w:p>
+    <w:p>
+      <w:pPr>
+        <w:pStyle w:val="ExamBody"/>
+      </w:pPr>
+      <w:r>
+        <w:t>26 Kinder einer Beispielklasse wurden gefragt: „Was wünschst du dir für den Schulalltag?“ Mehrere Antworten waren erlaubt. Die Zahlen sind erfunden.</w:t>
       </w:r>
     </w:p>
     <w:tbl>
       <w:tblPr>
-        <w:tblW w:type="auto" w:w="0"/>
-        <w:jc w:val="center"/>
+        <w:tblW w:type="dxa" w:w="10092"/>
+        <w:tblLayout w:type="fixed"/>
         <w:tblLook w:firstColumn="1" w:firstRow="1" w:lastColumn="0" w:lastRow="0" w:noHBand="0" w:noVBand="1" w:val="04A0"/>
+        <w:tblInd w:w="100" w:type="dxa"/>
+        <w:tblCellMar>
+          <w:top w:w="80" w:type="dxa"/>
+          <w:bottom w:w="80" w:type="dxa"/>
+          <w:left w:w="100" w:type="dxa"/>
+          <w:right w:w="100" w:type="dxa"/>
+        </w:tblCellMar>
       </w:tblPr>
       <w:tblGrid>
-        <w:gridCol w:w="10148"/>
+        <w:gridCol w:w="7257"/>
+        <w:gridCol w:w="2835"/>
       </w:tblGrid>
       <w:tr>
+        <w:trPr>
+          <w:cantSplit/>
+          <w:tblHeader/>
+        </w:trPr>
         <w:tc>
           <w:tcPr>
-            <w:tcW w:type="dxa" w:w="10148"/>
-            <w:shd w:fill="EDF5EA"/>
-            <w:tcMar>
-              <w:top w:w="80" w:type="dxa"/>
-              <w:start w:w="110" w:type="dxa"/>
-              <w:bottom w:w="80" w:type="dxa"/>
-              <w:end w:w="110" w:type="dxa"/>
-            </w:tcMar>
+            <w:tcW w:type="dxa" w:w="7257"/>
           </w:tcPr>
           <w:p>
             <w:pPr>
-              <w:spacing w:after="0"/>
+              <w:pStyle w:val="ExamBody"/>
+              <w:spacing w:after="40"/>
             </w:pPr>
             <w:r>
               <w:rPr>
                 <w:b/>
-                <w:color w:val="4D8B3F"/>
-                <w:sz w:val="21"/>
               </w:rPr>
-              <w:t>Funktion</w:t>
+              <w:t>Wunsch</w:t>
             </w:r>
+          </w:p>
+        </w:tc>
+        <w:tc>
+          <w:tcPr>
+            <w:tcW w:type="dxa" w:w="2835"/>
+          </w:tcPr>
+          <w:p>
+            <w:pPr>
+              <w:pStyle w:val="ExamBody"/>
+              <w:spacing w:after="40"/>
+            </w:pPr>
             <w:r>
-              <w:br/>
-              <w:t>Verpflichtend, unbenotet und im selben Grundformat wie die spätere Lernerfolgskontrolle: Situation + Daten + Schreibauftrag → Wunschbrief.</w:t>
+              <w:rPr>
+                <w:b/>
+              </w:rPr>
+              <w:t>Stimmen</w:t>
+            </w:r>
+          </w:p>
+        </w:tc>
+      </w:tr>
+      <w:tr>
+        <w:trPr>
+          <w:cantSplit/>
+        </w:trPr>
+        <w:tc>
+          <w:tcPr>
+            <w:tcW w:type="dxa" w:w="7257"/>
+          </w:tcPr>
+          <w:p>
+            <w:pPr>
+              <w:pStyle w:val="ExamBody"/>
+              <w:spacing w:after="40"/>
+            </w:pPr>
+            <w:r>
+              <w:rPr>
+                <w:b w:val="0"/>
+              </w:rPr>
+              <w:t>Ablagefächer</w:t>
+            </w:r>
+          </w:p>
+        </w:tc>
+        <w:tc>
+          <w:tcPr>
+            <w:tcW w:type="dxa" w:w="2835"/>
+          </w:tcPr>
+          <w:p>
+            <w:pPr>
+              <w:pStyle w:val="ExamBody"/>
+              <w:spacing w:after="40"/>
+            </w:pPr>
+            <w:r>
+              <w:rPr>
+                <w:b w:val="0"/>
+              </w:rPr>
+              <w:t>17</w:t>
+            </w:r>
+          </w:p>
+        </w:tc>
+      </w:tr>
+      <w:tr>
+        <w:trPr>
+          <w:cantSplit/>
+        </w:trPr>
+        <w:tc>
+          <w:tcPr>
+            <w:tcW w:type="dxa" w:w="7257"/>
+          </w:tcPr>
+          <w:p>
+            <w:pPr>
+              <w:pStyle w:val="ExamBody"/>
+              <w:spacing w:after="40"/>
+            </w:pPr>
+            <w:r>
+              <w:rPr>
+                <w:b w:val="0"/>
+              </w:rPr>
+              <w:t>Sitzkissen</w:t>
+            </w:r>
+          </w:p>
+        </w:tc>
+        <w:tc>
+          <w:tcPr>
+            <w:tcW w:type="dxa" w:w="2835"/>
+          </w:tcPr>
+          <w:p>
+            <w:pPr>
+              <w:pStyle w:val="ExamBody"/>
+              <w:spacing w:after="40"/>
+            </w:pPr>
+            <w:r>
+              <w:rPr>
+                <w:b w:val="0"/>
+              </w:rPr>
+              <w:t>14</w:t>
+            </w:r>
+          </w:p>
+        </w:tc>
+      </w:tr>
+      <w:tr>
+        <w:trPr>
+          <w:cantSplit/>
+        </w:trPr>
+        <w:tc>
+          <w:tcPr>
+            <w:tcW w:type="dxa" w:w="7257"/>
+          </w:tcPr>
+          <w:p>
+            <w:pPr>
+              <w:pStyle w:val="ExamBody"/>
+              <w:spacing w:after="40"/>
+            </w:pPr>
+            <w:r>
+              <w:rPr>
+                <w:b w:val="0"/>
+              </w:rPr>
+              <w:t>Pflanzen</w:t>
+            </w:r>
+          </w:p>
+        </w:tc>
+        <w:tc>
+          <w:tcPr>
+            <w:tcW w:type="dxa" w:w="2835"/>
+          </w:tcPr>
+          <w:p>
+            <w:pPr>
+              <w:pStyle w:val="ExamBody"/>
+              <w:spacing w:after="40"/>
+            </w:pPr>
+            <w:r>
+              <w:rPr>
+                <w:b w:val="0"/>
+              </w:rPr>
+              <w:t>11</w:t>
+            </w:r>
+          </w:p>
+        </w:tc>
+      </w:tr>
+      <w:tr>
+        <w:trPr>
+          <w:cantSplit/>
+        </w:trPr>
+        <w:tc>
+          <w:tcPr>
+            <w:tcW w:type="dxa" w:w="7257"/>
+          </w:tcPr>
+          <w:p>
+            <w:pPr>
+              <w:pStyle w:val="ExamBody"/>
+              <w:spacing w:after="40"/>
+            </w:pPr>
+            <w:r>
+              <w:rPr>
+                <w:b w:val="0"/>
+              </w:rPr>
+              <w:t>Bilder an der Wand</w:t>
+            </w:r>
+          </w:p>
+        </w:tc>
+        <w:tc>
+          <w:tcPr>
+            <w:tcW w:type="dxa" w:w="2835"/>
+          </w:tcPr>
+          <w:p>
+            <w:pPr>
+              <w:pStyle w:val="ExamBody"/>
+              <w:spacing w:after="40"/>
+            </w:pPr>
+            <w:r>
+              <w:rPr>
+                <w:b w:val="0"/>
+              </w:rPr>
+              <w:t>8</w:t>
             </w:r>
           </w:p>
         </w:tc>
@@ -73,540 +347,746 @@
     </w:tbl>
     <w:p>
       <w:pPr>
-        <w:spacing w:after="20"/>
-      </w:pPr>
-    </w:p>
-    <w:p>
-      <w:pPr>
-        <w:pStyle w:val="Heading1"/>
+        <w:pStyle w:val="ExamBody"/>
       </w:pPr>
       <w:r>
-        <w:t>Ziele</w:t>
+        <w:t>Arbeite mit Planung → Durchführung → Reflexion.</w:t>
       </w:r>
     </w:p>
     <w:p>
       <w:pPr>
-        <w:spacing w:after="20" w:line="240" w:lineRule="auto"/>
+        <w:pStyle w:val="ExamBody"/>
       </w:pPr>
       <w:r>
-        <w:rPr>
-          <w:b/>
-        </w:rPr>
-        <w:t xml:space="preserve">• </w:t>
-      </w:r>
-      <w:r>
-        <w:rPr>
-          <w:sz w:val="19"/>
-        </w:rPr>
-        <w:t>vollständigen Wunschbrief schreiben</w:t>
+        <w:t>Diese Probearbeit ist verpflichtend und bleibt ohne Note.</w:t>
       </w:r>
     </w:p>
     <w:p>
       <w:pPr>
-        <w:spacing w:after="20" w:line="240" w:lineRule="auto"/>
+        <w:pStyle w:val="ExamTitle"/>
+        <w:pageBreakBefore/>
       </w:pPr>
       <w:r>
-        <w:rPr>
-          <w:b/>
-        </w:rPr>
-        <w:t xml:space="preserve">• </w:t>
-      </w:r>
-      <w:r>
-        <w:rPr>
-          <w:sz w:val="19"/>
-        </w:rPr>
-        <w:t>Planung – Durchführung – Reflexion anwenden</w:t>
+        <w:t>Probearbeit · Planung</w:t>
       </w:r>
     </w:p>
     <w:p>
       <w:pPr>
-        <w:spacing w:after="20" w:line="240" w:lineRule="auto"/>
+        <w:pStyle w:val="ExamBody"/>
       </w:pPr>
       <w:r>
-        <w:rPr>
-          <w:b/>
-        </w:rPr>
-        <w:t xml:space="preserve">• </w:t>
-      </w:r>
-      <w:r>
-        <w:rPr>
-          <w:sz w:val="19"/>
-        </w:rPr>
-        <w:t>Brief mit Checkliste kontrollieren</w:t>
+        <w:t>Notiere Stichwörter. Deinen Brief schreibst du erst auf den Schreibbogen. Die beiden Hilfeseiten am Ende darfst du nutzen.</w:t>
       </w:r>
     </w:p>
     <w:p>
       <w:pPr>
-        <w:spacing w:after="20" w:line="240" w:lineRule="auto"/>
+        <w:pStyle w:val="ExamLabel"/>
       </w:pPr>
       <w:r>
-        <w:rPr>
-          <w:b/>
-        </w:rPr>
-        <w:t xml:space="preserve">• </w:t>
-      </w:r>
-      <w:r>
-        <w:rPr>
-          <w:sz w:val="19"/>
-        </w:rPr>
-        <w:t>Umfrageergebnis bei Bedarf als zusätzlichen Grund verwenden</w:t>
+        <w:t>An wen schreibst du?</w:t>
       </w:r>
     </w:p>
     <w:p>
       <w:pPr>
-        <w:pStyle w:val="Heading1"/>
+        <w:pStyle w:val="ExamBody"/>
+        <w:spacing w:after="0" w:line="440" w:lineRule="exact"/>
+        <w:pBdr>
+          <w:bottom w:val="single" w:sz="3" w:color="B2B8BC"/>
+          <w:between w:val="single" w:sz="3" w:color="B2B8BC"/>
+        </w:pBdr>
       </w:pPr>
       <w:r>
-        <w:t>Ablauf</w:t>
-      </w:r>
-    </w:p>
-    <w:tbl>
-      <w:tblPr>
-        <w:tblStyle w:val="TableGrid"/>
-        <w:tblW w:type="auto" w:w="0"/>
-        <w:jc w:val="center"/>
-        <w:tblLook w:firstColumn="1" w:firstRow="1" w:lastColumn="0" w:lastRow="0" w:noHBand="0" w:noVBand="1" w:val="04A0"/>
-      </w:tblPr>
-      <w:tblGrid>
-        <w:gridCol w:w="2537"/>
-        <w:gridCol w:w="2537"/>
-        <w:gridCol w:w="2537"/>
-        <w:gridCol w:w="2537"/>
-      </w:tblGrid>
-      <w:tr>
-        <w:tc>
-          <w:tcPr>
-            <w:tcW w:type="dxa" w:w="2537"/>
-            <w:shd w:fill="DCE6EC"/>
-          </w:tcPr>
-          <w:p>
-            <w:r>
-              <w:rPr>
-                <w:b/>
-              </w:rPr>
-              <w:t>Phase</w:t>
-            </w:r>
-          </w:p>
-        </w:tc>
-        <w:tc>
-          <w:tcPr>
-            <w:tcW w:type="dxa" w:w="2537"/>
-            <w:shd w:fill="DCE6EC"/>
-          </w:tcPr>
-          <w:p>
-            <w:r>
-              <w:rPr>
-                <w:b/>
-              </w:rPr>
-              <w:t>Zeit</w:t>
-            </w:r>
-          </w:p>
-        </w:tc>
-        <w:tc>
-          <w:tcPr>
-            <w:tcW w:type="dxa" w:w="2537"/>
-            <w:shd w:fill="DCE6EC"/>
-          </w:tcPr>
-          <w:p>
-            <w:r>
-              <w:rPr>
-                <w:b/>
-              </w:rPr>
-              <w:t>Seite</w:t>
-            </w:r>
-          </w:p>
-        </w:tc>
-        <w:tc>
-          <w:tcPr>
-            <w:tcW w:type="dxa" w:w="2537"/>
-            <w:shd w:fill="DCE6EC"/>
-          </w:tcPr>
-          <w:p>
-            <w:r>
-              <w:rPr>
-                <w:b/>
-              </w:rPr>
-              <w:t>Fokus</w:t>
-            </w:r>
-          </w:p>
-        </w:tc>
-      </w:tr>
-      <w:tr>
-        <w:tc>
-          <w:tcPr>
-            <w:tcW w:type="dxa" w:w="2537"/>
-          </w:tcPr>
-          <w:p>
-            <w:pPr>
-              <w:spacing w:after="0"/>
-            </w:pPr>
-            <w:r>
-              <w:rPr>
-                <w:sz w:val="17"/>
-              </w:rPr>
-              <w:t>Planung</w:t>
-            </w:r>
-          </w:p>
-        </w:tc>
-        <w:tc>
-          <w:tcPr>
-            <w:tcW w:type="dxa" w:w="2537"/>
-          </w:tcPr>
-          <w:p>
-            <w:pPr>
-              <w:spacing w:after="0"/>
-            </w:pPr>
-            <w:r>
-              <w:rPr>
-                <w:sz w:val="17"/>
-              </w:rPr>
-              <w:t>10–15 Min.</w:t>
-            </w:r>
-          </w:p>
-        </w:tc>
-        <w:tc>
-          <w:tcPr>
-            <w:tcW w:type="dxa" w:w="2537"/>
-          </w:tcPr>
-          <w:p>
-            <w:pPr>
-              <w:spacing w:after="0"/>
-            </w:pPr>
-            <w:r>
-              <w:rPr>
-                <w:sz w:val="17"/>
-              </w:rPr>
-              <w:t>3</w:t>
-            </w:r>
-          </w:p>
-        </w:tc>
-        <w:tc>
-          <w:tcPr>
-            <w:tcW w:type="dxa" w:w="2537"/>
-          </w:tcPr>
-          <w:p>
-            <w:pPr>
-              <w:spacing w:after="0"/>
-            </w:pPr>
-            <w:r>
-              <w:rPr>
-                <w:sz w:val="17"/>
-              </w:rPr>
-              <w:t>Schreibsituation klären, Stichwörter notieren</w:t>
-            </w:r>
-          </w:p>
-        </w:tc>
-      </w:tr>
-      <w:tr>
-        <w:tc>
-          <w:tcPr>
-            <w:tcW w:type="dxa" w:w="2537"/>
-          </w:tcPr>
-          <w:p>
-            <w:pPr>
-              <w:spacing w:after="0"/>
-            </w:pPr>
-            <w:r>
-              <w:rPr>
-                <w:sz w:val="17"/>
-              </w:rPr>
-              <w:t>Durchführung</w:t>
-            </w:r>
-          </w:p>
-        </w:tc>
-        <w:tc>
-          <w:tcPr>
-            <w:tcW w:type="dxa" w:w="2537"/>
-          </w:tcPr>
-          <w:p>
-            <w:pPr>
-              <w:spacing w:after="0"/>
-            </w:pPr>
-            <w:r>
-              <w:rPr>
-                <w:sz w:val="17"/>
-              </w:rPr>
-              <w:t>35–45 Min.</w:t>
-            </w:r>
-          </w:p>
-        </w:tc>
-        <w:tc>
-          <w:tcPr>
-            <w:tcW w:type="dxa" w:w="2537"/>
-          </w:tcPr>
-          <w:p>
-            <w:pPr>
-              <w:spacing w:after="0"/>
-            </w:pPr>
-            <w:r>
-              <w:rPr>
-                <w:sz w:val="17"/>
-              </w:rPr>
-              <w:t>4</w:t>
-            </w:r>
-          </w:p>
-        </w:tc>
-        <w:tc>
-          <w:tcPr>
-            <w:tcW w:type="dxa" w:w="2537"/>
-          </w:tcPr>
-          <w:p>
-            <w:pPr>
-              <w:spacing w:after="0"/>
-            </w:pPr>
-            <w:r>
-              <w:rPr>
-                <w:sz w:val="17"/>
-              </w:rPr>
-              <w:t>Brief verfassen</w:t>
-            </w:r>
-          </w:p>
-        </w:tc>
-      </w:tr>
-      <w:tr>
-        <w:tc>
-          <w:tcPr>
-            <w:tcW w:type="dxa" w:w="2537"/>
-          </w:tcPr>
-          <w:p>
-            <w:pPr>
-              <w:spacing w:after="0"/>
-            </w:pPr>
-            <w:r>
-              <w:rPr>
-                <w:sz w:val="17"/>
-              </w:rPr>
-              <w:t>Reflexion</w:t>
-            </w:r>
-          </w:p>
-        </w:tc>
-        <w:tc>
-          <w:tcPr>
-            <w:tcW w:type="dxa" w:w="2537"/>
-          </w:tcPr>
-          <w:p>
-            <w:pPr>
-              <w:spacing w:after="0"/>
-            </w:pPr>
-            <w:r>
-              <w:rPr>
-                <w:sz w:val="17"/>
-              </w:rPr>
-              <w:t>10–15 Min.</w:t>
-            </w:r>
-          </w:p>
-        </w:tc>
-        <w:tc>
-          <w:tcPr>
-            <w:tcW w:type="dxa" w:w="2537"/>
-          </w:tcPr>
-          <w:p>
-            <w:pPr>
-              <w:spacing w:after="0"/>
-            </w:pPr>
-            <w:r>
-              <w:rPr>
-                <w:sz w:val="17"/>
-              </w:rPr>
-              <w:t>5</w:t>
-            </w:r>
-          </w:p>
-        </w:tc>
-        <w:tc>
-          <w:tcPr>
-            <w:tcW w:type="dxa" w:w="2537"/>
-          </w:tcPr>
-          <w:p>
-            <w:pPr>
-              <w:spacing w:after="0"/>
-            </w:pPr>
-            <w:r>
-              <w:rPr>
-                <w:sz w:val="17"/>
-              </w:rPr>
-              <w:t>Checkliste und Selbsteinschätzung</w:t>
-            </w:r>
-          </w:p>
-        </w:tc>
-      </w:tr>
-      <w:tr>
-        <w:tc>
-          <w:tcPr>
-            <w:tcW w:type="dxa" w:w="2537"/>
-          </w:tcPr>
-          <w:p>
-            <w:pPr>
-              <w:spacing w:after="0"/>
-            </w:pPr>
-            <w:r>
-              <w:rPr>
-                <w:sz w:val="17"/>
-              </w:rPr>
-              <w:t>Rückmeldung</w:t>
-            </w:r>
-          </w:p>
-        </w:tc>
-        <w:tc>
-          <w:tcPr>
-            <w:tcW w:type="dxa" w:w="2537"/>
-          </w:tcPr>
-          <w:p>
-            <w:pPr>
-              <w:spacing w:after="0"/>
-            </w:pPr>
-            <w:r>
-              <w:rPr>
-                <w:sz w:val="17"/>
-              </w:rPr>
-              <w:t>kurz</w:t>
-            </w:r>
-          </w:p>
-        </w:tc>
-        <w:tc>
-          <w:tcPr>
-            <w:tcW w:type="dxa" w:w="2537"/>
-          </w:tcPr>
-          <w:p>
-            <w:pPr>
-              <w:spacing w:after="0"/>
-            </w:pPr>
-            <w:r>
-              <w:rPr>
-                <w:sz w:val="17"/>
-              </w:rPr>
-              <w:t>6</w:t>
-            </w:r>
-          </w:p>
-        </w:tc>
-        <w:tc>
-          <w:tcPr>
-            <w:tcW w:type="dxa" w:w="2537"/>
-          </w:tcPr>
-          <w:p>
-            <w:pPr>
-              <w:spacing w:after="0"/>
-            </w:pPr>
-            <w:r>
-              <w:rPr>
-                <w:sz w:val="17"/>
-              </w:rPr>
-              <w:t>Stärken und nächster Lernschritt</w:t>
-            </w:r>
-          </w:p>
-        </w:tc>
-      </w:tr>
-    </w:tbl>
-    <w:p>
-      <w:pPr>
-        <w:pStyle w:val="Heading1"/>
-      </w:pPr>
-      <w:r>
-        <w:t>Mindeststandard</w:t>
-      </w:r>
-    </w:p>
-    <w:tbl>
-      <w:tblPr>
-        <w:tblW w:type="auto" w:w="0"/>
-        <w:jc w:val="center"/>
-        <w:tblLook w:firstColumn="1" w:firstRow="1" w:lastColumn="0" w:lastRow="0" w:noHBand="0" w:noVBand="1" w:val="04A0"/>
-      </w:tblPr>
-      <w:tblGrid>
-        <w:gridCol w:w="10148"/>
-      </w:tblGrid>
-      <w:tr>
-        <w:tc>
-          <w:tcPr>
-            <w:tcW w:type="dxa" w:w="10148"/>
-            <w:shd w:fill="F8EEE7"/>
-            <w:tcMar>
-              <w:top w:w="80" w:type="dxa"/>
-              <w:start w:w="110" w:type="dxa"/>
-              <w:bottom w:w="80" w:type="dxa"/>
-              <w:end w:w="110" w:type="dxa"/>
-            </w:tcMar>
-          </w:tcPr>
-          <w:p>
-            <w:pPr>
-              <w:spacing w:after="0"/>
-            </w:pPr>
-            <w:r>
-              <w:rPr>
-                <w:b/>
-                <w:color w:val="D97A4A"/>
-                <w:sz w:val="21"/>
-              </w:rPr>
-              <w:t>Die Probearbeit ist gelungen, wenn …</w:t>
-            </w:r>
-            <w:r>
-              <w:br/>
-              <w:t>der Brief eine passende Anrede, einen verständlichen Wunsch, einen zusammenhängenden Brieftext, eine Grußformel und einen Namen enthält. Die Sprache ist freundlich und überwiegend verständlich.</w:t>
-            </w:r>
-          </w:p>
-        </w:tc>
-      </w:tr>
-    </w:tbl>
-    <w:p>
-      <w:pPr>
-        <w:spacing w:after="20"/>
-      </w:pPr>
-    </w:p>
-    <w:p>
-      <w:pPr>
-        <w:pStyle w:val="Heading1"/>
-      </w:pPr>
-      <w:r>
-        <w:t>Differenzierung</w:t>
+        <w:rPr>
+          <w:sz w:val="2"/>
+        </w:rPr>
+        <w:t xml:space="preserve"> </w:t>
       </w:r>
     </w:p>
     <w:p>
       <w:pPr>
-        <w:spacing w:after="20" w:line="240" w:lineRule="auto"/>
+        <w:pStyle w:val="ExamLabel"/>
       </w:pPr>
       <w:r>
-        <w:rPr>
-          <w:b/>
-        </w:rPr>
-        <w:t xml:space="preserve">• </w:t>
-      </w:r>
-      <w:r>
-        <w:rPr>
-          <w:sz w:val="18"/>
-        </w:rPr>
-        <w:t>Unterstützung: Satzstarter, Merkblätter, Briefgerüst, mündliche Vorplanung.</w:t>
+        <w:t>Was wünschst du dir?</w:t>
       </w:r>
     </w:p>
     <w:p>
       <w:pPr>
-        <w:spacing w:after="20" w:line="240" w:lineRule="auto"/>
+        <w:pStyle w:val="ExamBody"/>
+        <w:spacing w:after="0" w:line="440" w:lineRule="exact"/>
+        <w:pBdr>
+          <w:bottom w:val="single" w:sz="3" w:color="B2B8BC"/>
+          <w:between w:val="single" w:sz="3" w:color="B2B8BC"/>
+        </w:pBdr>
       </w:pPr>
       <w:r>
         <w:rPr>
-          <w:b/>
+          <w:sz w:val="2"/>
         </w:rPr>
-        <w:t xml:space="preserve">• </w:t>
-      </w:r>
-      <w:r>
-        <w:rPr>
-          <w:sz w:val="18"/>
-        </w:rPr>
-        <w:t>Regelstandard: selbstständige Planung und mindestens ein passender Grund.</w:t>
+        <w:t xml:space="preserve"> </w:t>
       </w:r>
     </w:p>
     <w:p>
       <w:pPr>
-        <w:spacing w:after="20" w:line="240" w:lineRule="auto"/>
+        <w:pStyle w:val="ExamLabel"/>
+      </w:pPr>
+      <w:r>
+        <w:t>Welcher weitere Satz passt zu deinem Wunsch?</w:t>
+      </w:r>
+    </w:p>
+    <w:p>
+      <w:pPr>
+        <w:pStyle w:val="ExamBody"/>
+        <w:spacing w:after="0" w:line="440" w:lineRule="exact"/>
+        <w:pBdr>
+          <w:bottom w:val="single" w:sz="3" w:color="B2B8BC"/>
+          <w:between w:val="single" w:sz="3" w:color="B2B8BC"/>
+        </w:pBdr>
       </w:pPr>
       <w:r>
         <w:rPr>
-          <w:b/>
+          <w:sz w:val="2"/>
         </w:rPr>
-        <w:t xml:space="preserve">• </w:t>
+        <w:t xml:space="preserve"> </w:t>
       </w:r>
+    </w:p>
+    <w:p>
+      <w:pPr>
+        <w:pStyle w:val="ExamLabel"/>
+      </w:pPr>
+      <w:r>
+        <w:t>Welche Anrede wählst du?</w:t>
+      </w:r>
+    </w:p>
+    <w:p>
+      <w:pPr>
+        <w:pStyle w:val="ExamBody"/>
+        <w:spacing w:after="0" w:line="440" w:lineRule="exact"/>
+        <w:pBdr>
+          <w:bottom w:val="single" w:sz="3" w:color="B2B8BC"/>
+          <w:between w:val="single" w:sz="3" w:color="B2B8BC"/>
+        </w:pBdr>
+      </w:pPr>
       <w:r>
         <w:rPr>
-          <w:sz w:val="18"/>
+          <w:sz w:val="2"/>
         </w:rPr>
-        <w:t>Expertenstandard: Umfrageergebnis gezielt einbauen und auf ein Bedenken eingehen.</w:t>
+        <w:t xml:space="preserve"> </w:t>
+      </w:r>
+    </w:p>
+    <w:p>
+      <w:pPr>
+        <w:pStyle w:val="ExamLabel"/>
+      </w:pPr>
+      <w:r>
+        <w:t>Welche Grußformel wählst du?</w:t>
+      </w:r>
+    </w:p>
+    <w:p>
+      <w:pPr>
+        <w:pStyle w:val="ExamBody"/>
+        <w:spacing w:after="0" w:line="440" w:lineRule="exact"/>
+        <w:pBdr>
+          <w:bottom w:val="single" w:sz="3" w:color="B2B8BC"/>
+          <w:between w:val="single" w:sz="3" w:color="B2B8BC"/>
+        </w:pBdr>
+      </w:pPr>
+      <w:r>
+        <w:rPr>
+          <w:sz w:val="2"/>
+        </w:rPr>
+        <w:t xml:space="preserve"> </w:t>
+      </w:r>
+    </w:p>
+    <w:p>
+      <w:pPr>
+        <w:pStyle w:val="ExamHeading"/>
+      </w:pPr>
+      <w:r>
+        <w:t>Nur wenn du Zusätze nutzen möchtest</w:t>
+      </w:r>
+    </w:p>
+    <w:p>
+      <w:pPr>
+        <w:pStyle w:val="ExamLabel"/>
+      </w:pPr>
+      <w:r>
+        <w:t>Welchen sachlichen Grund möchtest du nennen? · freiwillig</w:t>
+      </w:r>
+    </w:p>
+    <w:p>
+      <w:pPr>
+        <w:pStyle w:val="ExamBody"/>
+        <w:spacing w:after="0" w:line="440" w:lineRule="exact"/>
+        <w:pBdr>
+          <w:bottom w:val="single" w:sz="3" w:color="B2B8BC"/>
+          <w:between w:val="single" w:sz="3" w:color="B2B8BC"/>
+        </w:pBdr>
+      </w:pPr>
+      <w:r>
+        <w:rPr>
+          <w:sz w:val="2"/>
+        </w:rPr>
+        <w:t xml:space="preserve"> </w:t>
+      </w:r>
+    </w:p>
+    <w:p>
+      <w:pPr>
+        <w:pStyle w:val="ExamLabel"/>
+      </w:pPr>
+      <w:r>
+        <w:t>Welches passende Umfrageergebnis möchtest du nutzen? · freiwillig</w:t>
+      </w:r>
+    </w:p>
+    <w:p>
+      <w:pPr>
+        <w:pStyle w:val="ExamBody"/>
+        <w:spacing w:after="0" w:line="440" w:lineRule="exact"/>
+        <w:pBdr>
+          <w:bottom w:val="single" w:sz="3" w:color="B2B8BC"/>
+          <w:between w:val="single" w:sz="3" w:color="B2B8BC"/>
+        </w:pBdr>
+      </w:pPr>
+      <w:r>
+        <w:rPr>
+          <w:sz w:val="2"/>
+        </w:rPr>
+        <w:t xml:space="preserve"> </w:t>
+      </w:r>
+    </w:p>
+    <w:p>
+      <w:pPr>
+        <w:pStyle w:val="ExamBody"/>
+      </w:pPr>
+      <w:r>
+        <w:t>Die beiden Zusatzfelder dürfen leer bleiben.</w:t>
+      </w:r>
+    </w:p>
+    <w:p>
+      <w:pPr>
+        <w:pStyle w:val="ExamTitle"/>
+        <w:pageBreakBefore/>
+      </w:pPr>
+      <w:r>
+        <w:t>Probearbeit · Durchführung</w:t>
+      </w:r>
+    </w:p>
+    <w:p>
+      <w:pPr>
+        <w:pStyle w:val="ExamBody"/>
+      </w:pPr>
+      <w:r>
+        <w:t>Name: __________________________  Datum: ______________</w:t>
+      </w:r>
+    </w:p>
+    <w:p>
+      <w:pPr>
+        <w:pStyle w:val="ExamBody"/>
+      </w:pPr>
+      <w:r>
+        <w:t>Schreibe hier deinen vollständigen Brief. Bei Bedarf bekommst du weiteres Schreibpapier.</w:t>
+      </w:r>
+    </w:p>
+    <w:p>
+      <w:pPr>
+        <w:pStyle w:val="ExamBody"/>
+        <w:spacing w:after="0" w:line="500" w:lineRule="exact"/>
+        <w:pBdr>
+          <w:bottom w:val="single" w:sz="3" w:color="B2B8BC"/>
+          <w:between w:val="single" w:sz="3" w:color="B2B8BC"/>
+        </w:pBdr>
+      </w:pPr>
+      <w:r>
+        <w:rPr>
+          <w:sz w:val="2"/>
+        </w:rPr>
+        <w:t xml:space="preserve"> </w:t>
+      </w:r>
+    </w:p>
+    <w:p>
+      <w:pPr>
+        <w:pStyle w:val="ExamBody"/>
+        <w:spacing w:after="0" w:line="500" w:lineRule="exact"/>
+        <w:pBdr>
+          <w:bottom w:val="single" w:sz="3" w:color="B2B8BC"/>
+          <w:between w:val="single" w:sz="3" w:color="B2B8BC"/>
+        </w:pBdr>
+      </w:pPr>
+      <w:r>
+        <w:rPr>
+          <w:sz w:val="2"/>
+        </w:rPr>
+        <w:t xml:space="preserve"> </w:t>
+      </w:r>
+    </w:p>
+    <w:p>
+      <w:pPr>
+        <w:pStyle w:val="ExamBody"/>
+        <w:spacing w:after="0" w:line="500" w:lineRule="exact"/>
+        <w:pBdr>
+          <w:bottom w:val="single" w:sz="3" w:color="B2B8BC"/>
+          <w:between w:val="single" w:sz="3" w:color="B2B8BC"/>
+        </w:pBdr>
+      </w:pPr>
+      <w:r>
+        <w:rPr>
+          <w:sz w:val="2"/>
+        </w:rPr>
+        <w:t xml:space="preserve"> </w:t>
+      </w:r>
+    </w:p>
+    <w:p>
+      <w:pPr>
+        <w:pStyle w:val="ExamBody"/>
+        <w:spacing w:after="0" w:line="500" w:lineRule="exact"/>
+        <w:pBdr>
+          <w:bottom w:val="single" w:sz="3" w:color="B2B8BC"/>
+          <w:between w:val="single" w:sz="3" w:color="B2B8BC"/>
+        </w:pBdr>
+      </w:pPr>
+      <w:r>
+        <w:rPr>
+          <w:sz w:val="2"/>
+        </w:rPr>
+        <w:t xml:space="preserve"> </w:t>
+      </w:r>
+    </w:p>
+    <w:p>
+      <w:pPr>
+        <w:pStyle w:val="ExamBody"/>
+        <w:spacing w:after="0" w:line="500" w:lineRule="exact"/>
+        <w:pBdr>
+          <w:bottom w:val="single" w:sz="3" w:color="B2B8BC"/>
+          <w:between w:val="single" w:sz="3" w:color="B2B8BC"/>
+        </w:pBdr>
+      </w:pPr>
+      <w:r>
+        <w:rPr>
+          <w:sz w:val="2"/>
+        </w:rPr>
+        <w:t xml:space="preserve"> </w:t>
+      </w:r>
+    </w:p>
+    <w:p>
+      <w:pPr>
+        <w:pStyle w:val="ExamBody"/>
+        <w:spacing w:after="0" w:line="500" w:lineRule="exact"/>
+        <w:pBdr>
+          <w:bottom w:val="single" w:sz="3" w:color="B2B8BC"/>
+          <w:between w:val="single" w:sz="3" w:color="B2B8BC"/>
+        </w:pBdr>
+      </w:pPr>
+      <w:r>
+        <w:rPr>
+          <w:sz w:val="2"/>
+        </w:rPr>
+        <w:t xml:space="preserve"> </w:t>
+      </w:r>
+    </w:p>
+    <w:p>
+      <w:pPr>
+        <w:pStyle w:val="ExamBody"/>
+        <w:spacing w:after="0" w:line="500" w:lineRule="exact"/>
+        <w:pBdr>
+          <w:bottom w:val="single" w:sz="3" w:color="B2B8BC"/>
+          <w:between w:val="single" w:sz="3" w:color="B2B8BC"/>
+        </w:pBdr>
+      </w:pPr>
+      <w:r>
+        <w:rPr>
+          <w:sz w:val="2"/>
+        </w:rPr>
+        <w:t xml:space="preserve"> </w:t>
+      </w:r>
+    </w:p>
+    <w:p>
+      <w:pPr>
+        <w:pStyle w:val="ExamBody"/>
+        <w:spacing w:after="0" w:line="500" w:lineRule="exact"/>
+        <w:pBdr>
+          <w:bottom w:val="single" w:sz="3" w:color="B2B8BC"/>
+          <w:between w:val="single" w:sz="3" w:color="B2B8BC"/>
+        </w:pBdr>
+      </w:pPr>
+      <w:r>
+        <w:rPr>
+          <w:sz w:val="2"/>
+        </w:rPr>
+        <w:t xml:space="preserve"> </w:t>
+      </w:r>
+    </w:p>
+    <w:p>
+      <w:pPr>
+        <w:pStyle w:val="ExamBody"/>
+        <w:spacing w:after="0" w:line="500" w:lineRule="exact"/>
+        <w:pBdr>
+          <w:bottom w:val="single" w:sz="3" w:color="B2B8BC"/>
+          <w:between w:val="single" w:sz="3" w:color="B2B8BC"/>
+        </w:pBdr>
+      </w:pPr>
+      <w:r>
+        <w:rPr>
+          <w:sz w:val="2"/>
+        </w:rPr>
+        <w:t xml:space="preserve"> </w:t>
+      </w:r>
+    </w:p>
+    <w:p>
+      <w:pPr>
+        <w:pStyle w:val="ExamBody"/>
+        <w:spacing w:after="0" w:line="500" w:lineRule="exact"/>
+        <w:pBdr>
+          <w:bottom w:val="single" w:sz="3" w:color="B2B8BC"/>
+          <w:between w:val="single" w:sz="3" w:color="B2B8BC"/>
+        </w:pBdr>
+      </w:pPr>
+      <w:r>
+        <w:rPr>
+          <w:sz w:val="2"/>
+        </w:rPr>
+        <w:t xml:space="preserve"> </w:t>
+      </w:r>
+    </w:p>
+    <w:p>
+      <w:pPr>
+        <w:pStyle w:val="ExamBody"/>
+        <w:spacing w:after="0" w:line="500" w:lineRule="exact"/>
+        <w:pBdr>
+          <w:bottom w:val="single" w:sz="3" w:color="B2B8BC"/>
+          <w:between w:val="single" w:sz="3" w:color="B2B8BC"/>
+        </w:pBdr>
+      </w:pPr>
+      <w:r>
+        <w:rPr>
+          <w:sz w:val="2"/>
+        </w:rPr>
+        <w:t xml:space="preserve"> </w:t>
+      </w:r>
+    </w:p>
+    <w:p>
+      <w:pPr>
+        <w:pStyle w:val="ExamBody"/>
+        <w:spacing w:after="0" w:line="500" w:lineRule="exact"/>
+        <w:pBdr>
+          <w:bottom w:val="single" w:sz="3" w:color="B2B8BC"/>
+          <w:between w:val="single" w:sz="3" w:color="B2B8BC"/>
+        </w:pBdr>
+      </w:pPr>
+      <w:r>
+        <w:rPr>
+          <w:sz w:val="2"/>
+        </w:rPr>
+        <w:t xml:space="preserve"> </w:t>
+      </w:r>
+    </w:p>
+    <w:p>
+      <w:pPr>
+        <w:pStyle w:val="ExamBody"/>
+        <w:spacing w:after="0" w:line="500" w:lineRule="exact"/>
+        <w:pBdr>
+          <w:bottom w:val="single" w:sz="3" w:color="B2B8BC"/>
+          <w:between w:val="single" w:sz="3" w:color="B2B8BC"/>
+        </w:pBdr>
+      </w:pPr>
+      <w:r>
+        <w:rPr>
+          <w:sz w:val="2"/>
+        </w:rPr>
+        <w:t xml:space="preserve"> </w:t>
+      </w:r>
+    </w:p>
+    <w:p>
+      <w:pPr>
+        <w:pStyle w:val="ExamBody"/>
+        <w:spacing w:after="0" w:line="500" w:lineRule="exact"/>
+        <w:pBdr>
+          <w:bottom w:val="single" w:sz="3" w:color="B2B8BC"/>
+          <w:between w:val="single" w:sz="3" w:color="B2B8BC"/>
+        </w:pBdr>
+      </w:pPr>
+      <w:r>
+        <w:rPr>
+          <w:sz w:val="2"/>
+        </w:rPr>
+        <w:t xml:space="preserve"> </w:t>
+      </w:r>
+    </w:p>
+    <w:p>
+      <w:pPr>
+        <w:pStyle w:val="ExamBody"/>
+        <w:spacing w:after="0" w:line="500" w:lineRule="exact"/>
+        <w:pBdr>
+          <w:bottom w:val="single" w:sz="3" w:color="B2B8BC"/>
+          <w:between w:val="single" w:sz="3" w:color="B2B8BC"/>
+        </w:pBdr>
+      </w:pPr>
+      <w:r>
+        <w:rPr>
+          <w:sz w:val="2"/>
+        </w:rPr>
+        <w:t xml:space="preserve"> </w:t>
+      </w:r>
+    </w:p>
+    <w:p>
+      <w:pPr>
+        <w:pStyle w:val="ExamBody"/>
+        <w:spacing w:after="0" w:line="500" w:lineRule="exact"/>
+        <w:pBdr>
+          <w:bottom w:val="single" w:sz="3" w:color="B2B8BC"/>
+          <w:between w:val="single" w:sz="3" w:color="B2B8BC"/>
+        </w:pBdr>
+      </w:pPr>
+      <w:r>
+        <w:rPr>
+          <w:sz w:val="2"/>
+        </w:rPr>
+        <w:t xml:space="preserve"> </w:t>
+      </w:r>
+    </w:p>
+    <w:p>
+      <w:pPr>
+        <w:pStyle w:val="ExamBody"/>
+        <w:spacing w:after="0" w:line="500" w:lineRule="exact"/>
+        <w:pBdr>
+          <w:bottom w:val="single" w:sz="3" w:color="B2B8BC"/>
+          <w:between w:val="single" w:sz="3" w:color="B2B8BC"/>
+        </w:pBdr>
+      </w:pPr>
+      <w:r>
+        <w:rPr>
+          <w:sz w:val="2"/>
+        </w:rPr>
+        <w:t xml:space="preserve"> </w:t>
+      </w:r>
+    </w:p>
+    <w:p>
+      <w:pPr>
+        <w:pStyle w:val="ExamBody"/>
+        <w:spacing w:after="0" w:line="500" w:lineRule="exact"/>
+        <w:pBdr>
+          <w:bottom w:val="single" w:sz="3" w:color="B2B8BC"/>
+          <w:between w:val="single" w:sz="3" w:color="B2B8BC"/>
+        </w:pBdr>
+      </w:pPr>
+      <w:r>
+        <w:rPr>
+          <w:sz w:val="2"/>
+        </w:rPr>
+        <w:t xml:space="preserve"> </w:t>
+      </w:r>
+    </w:p>
+    <w:p>
+      <w:pPr>
+        <w:pStyle w:val="ExamBody"/>
+        <w:spacing w:after="0" w:line="500" w:lineRule="exact"/>
+        <w:pBdr>
+          <w:bottom w:val="single" w:sz="3" w:color="B2B8BC"/>
+          <w:between w:val="single" w:sz="3" w:color="B2B8BC"/>
+        </w:pBdr>
+      </w:pPr>
+      <w:r>
+        <w:rPr>
+          <w:sz w:val="2"/>
+        </w:rPr>
+        <w:t xml:space="preserve"> </w:t>
+      </w:r>
+    </w:p>
+    <w:p>
+      <w:pPr>
+        <w:pStyle w:val="ExamBody"/>
+        <w:spacing w:after="0" w:line="500" w:lineRule="exact"/>
+        <w:pBdr>
+          <w:bottom w:val="single" w:sz="3" w:color="B2B8BC"/>
+          <w:between w:val="single" w:sz="3" w:color="B2B8BC"/>
+        </w:pBdr>
+      </w:pPr>
+      <w:r>
+        <w:rPr>
+          <w:sz w:val="2"/>
+        </w:rPr>
+        <w:t xml:space="preserve"> </w:t>
+      </w:r>
+    </w:p>
+    <w:p>
+      <w:pPr>
+        <w:pStyle w:val="ExamBody"/>
+        <w:spacing w:after="0" w:line="500" w:lineRule="exact"/>
+        <w:pBdr>
+          <w:bottom w:val="single" w:sz="3" w:color="B2B8BC"/>
+          <w:between w:val="single" w:sz="3" w:color="B2B8BC"/>
+        </w:pBdr>
+      </w:pPr>
+      <w:r>
+        <w:rPr>
+          <w:sz w:val="2"/>
+        </w:rPr>
+        <w:t xml:space="preserve"> </w:t>
+      </w:r>
+    </w:p>
+    <w:p>
+      <w:pPr>
+        <w:pStyle w:val="ExamHeading"/>
+      </w:pPr>
+      <w:r>
+        <w:t>Reflexion</w:t>
+      </w:r>
+    </w:p>
+    <w:p>
+      <w:pPr>
+        <w:pStyle w:val="ExamBody"/>
+      </w:pPr>
+      <w:r>
+        <w:t>Lies deinen Brief. Prüfe ihn mit „Dein Wunschbrief: Das zählt“. Verbessere nur, was nötig ist. Die zwei Hilfeseiten folgen direkt.</w:t>
+      </w:r>
+    </w:p>
+    <w:p>
+      <w:pPr>
+        <w:pStyle w:val="Title"/>
+        <w:pageBreakBefore/>
+      </w:pPr>
+      <w:r>
+        <w:t>Dein Wunschbrief: Das zählt</w:t>
+      </w:r>
+    </w:p>
+    <w:p>
+      <w:r>
+        <w:t>Dein Ziel: Du schreibst einen freundlichen und verständlichen Wunschbrief.</w:t>
+      </w:r>
+    </w:p>
+    <w:p>
+      <w:r>
+        <w:rPr>
+          <w:b w:val="0"/>
+        </w:rPr>
+        <w:t>Name: __________________________</w:t>
+      </w:r>
+    </w:p>
+    <w:p>
+      <w:pPr>
+        <w:pStyle w:val="Heading2"/>
+      </w:pPr>
+      <w:r>
+        <w:t>Das gehört in deinen Brief</w:t>
+      </w:r>
+    </w:p>
+    <w:p>
+      <w:r>
+        <w:rPr>
+          <w:b w:val="0"/>
+        </w:rPr>
+        <w:t>☐ Du schreibst eine passende Anrede.</w:t>
+      </w:r>
+    </w:p>
+    <w:p>
+      <w:r>
+        <w:rPr>
+          <w:b w:val="0"/>
+        </w:rPr>
+        <w:t>☐ Du sagst klar, was du dir wünschst.</w:t>
+      </w:r>
+    </w:p>
+    <w:p>
+      <w:r>
+        <w:rPr>
+          <w:b w:val="0"/>
+        </w:rPr>
+        <w:t>☐ Du schreibst mindestens einen weiteren Satz zu deinem Wunsch.</w:t>
+      </w:r>
+    </w:p>
+    <w:p>
+      <w:r>
+        <w:rPr>
+          <w:b w:val="0"/>
+        </w:rPr>
+        <w:t>☐ Du beendest den Brief mit einer Grußformel und deinem Namen.</w:t>
+      </w:r>
+    </w:p>
+    <w:p>
+      <w:r>
+        <w:rPr>
+          <w:b w:val="0"/>
+        </w:rPr>
+        <w:t>☐ Du schreibst freundlich.</w:t>
+      </w:r>
+    </w:p>
+    <w:p>
+      <w:r>
+        <w:rPr>
+          <w:b w:val="0"/>
+        </w:rPr>
+        <w:t>☐ Du schreibst verständliche Sätze. Deine Schrift ist lesbar.</w:t>
+      </w:r>
+    </w:p>
+    <w:p>
+      <w:r>
+        <w:rPr>
+          <w:b w:val="0"/>
+        </w:rPr>
+        <w:t>☐ Du schreibst Ort und Datum oben auf deinen Brief.</w:t>
+      </w:r>
+    </w:p>
+    <w:p>
+      <w:r>
+        <w:rPr>
+          <w:b w:val="0"/>
+        </w:rPr>
+        <w:t>Ort und Datum gehören dazu. Wenn du sie vergisst, kannst du das Grundziel trotzdem erreichen. Beim Briefaufbau fehlt dann ein Punkt.</w:t>
+      </w:r>
+    </w:p>
+    <w:p>
+      <w:pPr>
+        <w:pStyle w:val="Heading2"/>
+      </w:pPr>
+      <w:r>
+        <w:t>Das kannst du zusätzlich zeigen</w:t>
+      </w:r>
+    </w:p>
+    <w:p>
+      <w:r>
+        <w:rPr>
+          <w:b w:val="0"/>
+        </w:rPr>
+        <w:t>☐ Du erklärst, warum dein Wunsch sinnvoll ist.</w:t>
+      </w:r>
+    </w:p>
+    <w:p>
+      <w:r>
+        <w:rPr>
+          <w:b w:val="0"/>
+        </w:rPr>
+        <w:t>☐ Du nennst ein passendes Ergebnis aus der Umfrage.</w:t>
+      </w:r>
+    </w:p>
+    <w:p>
+      <w:r>
+        <w:rPr>
+          <w:b w:val="0"/>
+        </w:rPr>
+        <w:t>Diese beiden Zusätze sind freiwillig. Du kannst für jeden Zusatz bis zu zwei weitere Punkte bekommen.</w:t>
+      </w:r>
+    </w:p>
+    <w:p>
+      <w:pPr>
+        <w:pStyle w:val="Heading2"/>
+      </w:pPr>
+      <w:r>
+        <w:t>So wird dein Brief bewertet</w:t>
+      </w:r>
+    </w:p>
+    <w:p>
+      <w:r>
+        <w:rPr>
+          <w:b w:val="0"/>
+        </w:rPr>
+        <w:t>Für einen klaren, vollständigen und gut lesbaren Brief kannst du 18 Grundpunkte bekommen. Ein kurzer Brief kann alle Grundpunkte bekommen.</w:t>
+      </w:r>
+    </w:p>
+    <w:p>
+      <w:r>
+        <w:rPr>
+          <w:b w:val="0"/>
+        </w:rPr>
+        <w:t>Du musst keine Zahlen nutzen. Du musst deinen Brief auch nicht länger machen, wenn schon alles Wichtige darin steht.</w:t>
       </w:r>
     </w:p>
     <w:p>
@@ -616,1001 +1096,347 @@
     </w:p>
     <w:p>
       <w:pPr>
-        <w:pStyle w:val="Title"/>
+        <w:pStyle w:val="Heading1"/>
       </w:pPr>
       <w:r>
-        <w:t>Probearbeit: Ein Wunsch für unseren Klassenraum</w:t>
+        <w:t>Diese Hilfe darfst du nutzen</w:t>
+      </w:r>
+    </w:p>
+    <w:p>
+      <w:r>
+        <w:rPr>
+          <w:b w:val="0"/>
+        </w:rPr>
+        <w:t>Diese beiden Seiten darfst du bei der Probearbeit und bei der Arbeit nutzen. Dafür werden keine Punkte abgezogen.</w:t>
+      </w:r>
+    </w:p>
+    <w:p>
+      <w:pPr>
+        <w:pStyle w:val="Heading2"/>
+      </w:pPr>
+      <w:r>
+        <w:t>Planung</w:t>
+      </w:r>
+    </w:p>
+    <w:p>
+      <w:r>
+        <w:rPr>
+          <w:b w:val="0"/>
+        </w:rPr>
+        <w:t>Kläre: An wen schreibst du? Was wünschst du dir? Welcher weitere Satz passt dazu? Notiere Stichwörter in deinen Schreibplan.</w:t>
+      </w:r>
+    </w:p>
+    <w:p>
+      <w:pPr>
+        <w:pStyle w:val="Heading2"/>
+      </w:pPr>
+      <w:r>
+        <w:t>Durchführung</w:t>
+      </w:r>
+    </w:p>
+    <w:p>
+      <w:r>
+        <w:rPr>
+          <w:b w:val="0"/>
+        </w:rPr>
+        <w:t>Schreibe deinen Brief in dieser Reihenfolge:</w:t>
       </w:r>
     </w:p>
     <w:tbl>
       <w:tblPr>
-        <w:tblW w:type="auto" w:w="0"/>
-        <w:jc w:val="center"/>
+        <w:tblW w:type="dxa" w:w="10091"/>
+        <w:tblLayout w:type="fixed"/>
         <w:tblLook w:firstColumn="1" w:firstRow="1" w:lastColumn="0" w:lastRow="0" w:noHBand="0" w:noVBand="1" w:val="04A0"/>
+        <w:tblInd w:w="120" w:type="dxa"/>
+        <w:tblCellMar>
+          <w:top w:w="95" w:type="dxa"/>
+          <w:left w:w="120" w:type="dxa"/>
+          <w:bottom w:w="95" w:type="dxa"/>
+          <w:right w:w="120" w:type="dxa"/>
+        </w:tblCellMar>
       </w:tblPr>
       <w:tblGrid>
-        <w:gridCol w:w="10148"/>
+        <w:gridCol w:w="680"/>
+        <w:gridCol w:w="9411"/>
       </w:tblGrid>
       <w:tr>
+        <w:trPr>
+          <w:cantSplit/>
+        </w:trPr>
         <w:tc>
           <w:tcPr>
-            <w:tcW w:type="dxa" w:w="10148"/>
-            <w:shd w:fill="EDF5EA"/>
-            <w:tcMar>
-              <w:top w:w="80" w:type="dxa"/>
-              <w:start w:w="110" w:type="dxa"/>
-              <w:bottom w:w="80" w:type="dxa"/>
-              <w:end w:w="110" w:type="dxa"/>
-            </w:tcMar>
+            <w:tcW w:type="dxa" w:w="680"/>
+            <w:shd w:fill="EEF2F4"/>
           </w:tcPr>
           <w:p>
             <w:pPr>
-              <w:spacing w:after="0"/>
+              <w:spacing w:after="60" w:before="20"/>
             </w:pPr>
             <w:r>
               <w:rPr>
+                <w:rFonts w:ascii="Arial" w:hAnsi="Arial"/>
                 <w:b/>
-                <w:color w:val="4D8B3F"/>
-                <w:sz w:val="21"/>
+                <w:sz w:val="28"/>
               </w:rPr>
-              <w:t>Wichtig</w:t>
+              <w:t>1</w:t>
             </w:r>
+          </w:p>
+        </w:tc>
+        <w:tc>
+          <w:tcPr>
+            <w:tcW w:type="dxa" w:w="9411"/>
+            <w:shd w:fill="F7F8F8"/>
+          </w:tcPr>
+          <w:p>
+            <w:pPr>
+              <w:spacing w:after="60" w:before="20"/>
+            </w:pPr>
             <w:r>
-              <w:br/>
-              <w:t>Diese Probearbeit wird nicht benotet. Sie zeigt dir, was du schon kannst und was du vor der Arbeit noch üben solltest.</w:t>
+              <w:rPr>
+                <w:rFonts w:ascii="Arial" w:hAnsi="Arial"/>
+                <w:b w:val="0"/>
+                <w:sz w:val="28"/>
+              </w:rPr>
+              <w:t>Ort und Datum</w:t>
+            </w:r>
+          </w:p>
+        </w:tc>
+      </w:tr>
+      <w:tr>
+        <w:trPr>
+          <w:cantSplit/>
+        </w:trPr>
+        <w:tc>
+          <w:tcPr>
+            <w:tcW w:type="dxa" w:w="680"/>
+            <w:shd w:fill="EEF2F4"/>
+          </w:tcPr>
+          <w:p>
+            <w:pPr>
+              <w:spacing w:after="60" w:before="20"/>
+            </w:pPr>
+            <w:r>
+              <w:rPr>
+                <w:rFonts w:ascii="Arial" w:hAnsi="Arial"/>
+                <w:b/>
+                <w:sz w:val="28"/>
+              </w:rPr>
+              <w:t>2</w:t>
+            </w:r>
+          </w:p>
+        </w:tc>
+        <w:tc>
+          <w:tcPr>
+            <w:tcW w:type="dxa" w:w="9411"/>
+            <w:shd w:fill="FFFFFF"/>
+          </w:tcPr>
+          <w:p>
+            <w:pPr>
+              <w:spacing w:after="60" w:before="20"/>
+            </w:pPr>
+            <w:r>
+              <w:rPr>
+                <w:rFonts w:ascii="Arial" w:hAnsi="Arial"/>
+                <w:b w:val="0"/>
+                <w:sz w:val="28"/>
+              </w:rPr>
+              <w:t>Anrede</w:t>
+            </w:r>
+          </w:p>
+        </w:tc>
+      </w:tr>
+      <w:tr>
+        <w:trPr>
+          <w:cantSplit/>
+        </w:trPr>
+        <w:tc>
+          <w:tcPr>
+            <w:tcW w:type="dxa" w:w="680"/>
+            <w:shd w:fill="EEF2F4"/>
+          </w:tcPr>
+          <w:p>
+            <w:pPr>
+              <w:spacing w:after="60" w:before="20"/>
+            </w:pPr>
+            <w:r>
+              <w:rPr>
+                <w:rFonts w:ascii="Arial" w:hAnsi="Arial"/>
+                <w:b/>
+                <w:sz w:val="28"/>
+              </w:rPr>
+              <w:t>3</w:t>
+            </w:r>
+          </w:p>
+        </w:tc>
+        <w:tc>
+          <w:tcPr>
+            <w:tcW w:type="dxa" w:w="9411"/>
+            <w:shd w:fill="F7F8F8"/>
+          </w:tcPr>
+          <w:p>
+            <w:pPr>
+              <w:spacing w:after="60" w:before="20"/>
+            </w:pPr>
+            <w:r>
+              <w:rPr>
+                <w:rFonts w:ascii="Arial" w:hAnsi="Arial"/>
+                <w:b w:val="0"/>
+                <w:sz w:val="28"/>
+              </w:rPr>
+              <w:t>Dein Wunsch und mindestens ein weiterer passender Satz</w:t>
+            </w:r>
+          </w:p>
+        </w:tc>
+      </w:tr>
+      <w:tr>
+        <w:trPr>
+          <w:cantSplit/>
+        </w:trPr>
+        <w:tc>
+          <w:tcPr>
+            <w:tcW w:type="dxa" w:w="680"/>
+            <w:shd w:fill="EEF2F4"/>
+          </w:tcPr>
+          <w:p>
+            <w:pPr>
+              <w:spacing w:after="60" w:before="20"/>
+            </w:pPr>
+            <w:r>
+              <w:rPr>
+                <w:rFonts w:ascii="Arial" w:hAnsi="Arial"/>
+                <w:b/>
+                <w:sz w:val="28"/>
+              </w:rPr>
+              <w:t>4</w:t>
+            </w:r>
+          </w:p>
+        </w:tc>
+        <w:tc>
+          <w:tcPr>
+            <w:tcW w:type="dxa" w:w="9411"/>
+            <w:shd w:fill="FFFFFF"/>
+          </w:tcPr>
+          <w:p>
+            <w:pPr>
+              <w:spacing w:after="60" w:before="20"/>
+            </w:pPr>
+            <w:r>
+              <w:rPr>
+                <w:rFonts w:ascii="Arial" w:hAnsi="Arial"/>
+                <w:b w:val="0"/>
+                <w:sz w:val="28"/>
+              </w:rPr>
+              <w:t>Grußformel</w:t>
+            </w:r>
+          </w:p>
+        </w:tc>
+      </w:tr>
+      <w:tr>
+        <w:trPr>
+          <w:cantSplit/>
+        </w:trPr>
+        <w:tc>
+          <w:tcPr>
+            <w:tcW w:type="dxa" w:w="680"/>
+            <w:shd w:fill="EEF2F4"/>
+          </w:tcPr>
+          <w:p>
+            <w:pPr>
+              <w:spacing w:after="60" w:before="20"/>
+            </w:pPr>
+            <w:r>
+              <w:rPr>
+                <w:rFonts w:ascii="Arial" w:hAnsi="Arial"/>
+                <w:b/>
+                <w:sz w:val="28"/>
+              </w:rPr>
+              <w:t>5</w:t>
+            </w:r>
+          </w:p>
+        </w:tc>
+        <w:tc>
+          <w:tcPr>
+            <w:tcW w:type="dxa" w:w="9411"/>
+            <w:shd w:fill="F7F8F8"/>
+          </w:tcPr>
+          <w:p>
+            <w:pPr>
+              <w:spacing w:after="60" w:before="20"/>
+            </w:pPr>
+            <w:r>
+              <w:rPr>
+                <w:rFonts w:ascii="Arial" w:hAnsi="Arial"/>
+                <w:b w:val="0"/>
+                <w:sz w:val="28"/>
+              </w:rPr>
+              <w:t>Dein Name</w:t>
             </w:r>
           </w:p>
         </w:tc>
       </w:tr>
     </w:tbl>
     <w:p>
-      <w:pPr>
-        <w:spacing w:after="20"/>
-      </w:pPr>
-    </w:p>
-    <w:p>
-      <w:pPr>
-        <w:pStyle w:val="Heading1"/>
-      </w:pPr>
-      <w:r>
-        <w:t>Die Situation</w:t>
-      </w:r>
-    </w:p>
-    <w:p>
-      <w:pPr>
-        <w:spacing w:after="60"/>
-      </w:pPr>
-      <w:r>
-        <w:rPr>
-          <w:b w:val="0"/>
-        </w:rPr>
-        <w:t xml:space="preserve">Eure Klasse möchte den Klassenraum gemütlicher und praktischer gestalten. </w:t>
-      </w:r>
       <w:r>
         <w:rPr>
           <w:b/>
         </w:rPr>
-        <w:t xml:space="preserve">Ihr habt dazu eine Umfrage durchgeführt. </w:t>
-      </w:r>
-      <w:r>
-        <w:t>Nun sollst du einen Brief an die Schulleitung schreiben.</w:t>
-      </w:r>
-    </w:p>
-    <w:p>
-      <w:pPr>
-        <w:jc w:val="center"/>
-      </w:pPr>
-      <w:r>
-        <w:drawing>
-          <wp:inline xmlns:a="http://schemas.openxmlformats.org/drawingml/2006/main" xmlns:pic="http://schemas.openxmlformats.org/drawingml/2006/picture">
-            <wp:extent cx="5220000" cy="2636815"/>
-            <wp:docPr id="1" name="Picture 1"/>
-            <wp:cNvGraphicFramePr>
-              <a:graphicFrameLocks noChangeAspect="1"/>
-            </wp:cNvGraphicFramePr>
-            <a:graphic>
-              <a:graphicData uri="http://schemas.openxmlformats.org/drawingml/2006/picture">
-                <pic:pic>
-                  <pic:nvPicPr>
-                    <pic:cNvPr id="0" name="umfrage_klassenraum.png"/>
-                    <pic:cNvPicPr/>
-                  </pic:nvPicPr>
-                  <pic:blipFill>
-                    <a:blip r:embed="rId9"/>
-                    <a:stretch>
-                      <a:fillRect/>
-                    </a:stretch>
-                  </pic:blipFill>
-                  <pic:spPr>
-                    <a:xfrm>
-                      <a:off x="0" y="0"/>
-                      <a:ext cx="5220000" cy="2636815"/>
-                    </a:xfrm>
-                    <a:prstGeom prst="rect"/>
-                  </pic:spPr>
-                </pic:pic>
-              </a:graphicData>
-            </a:graphic>
-          </wp:inline>
-        </w:drawing>
-      </w:r>
-    </w:p>
-    <w:p>
-      <w:pPr>
-        <w:pStyle w:val="Heading1"/>
-      </w:pPr>
-      <w:r>
-        <w:t>Dein Schreibauftrag</w:t>
-      </w:r>
-    </w:p>
-    <w:tbl>
-      <w:tblPr>
-        <w:tblW w:type="auto" w:w="0"/>
-        <w:jc w:val="center"/>
-        <w:tblLook w:firstColumn="1" w:firstRow="1" w:lastColumn="0" w:lastRow="0" w:noHBand="0" w:noVBand="1" w:val="04A0"/>
-      </w:tblPr>
-      <w:tblGrid>
-        <w:gridCol w:w="10148"/>
-      </w:tblGrid>
-      <w:tr>
-        <w:tc>
-          <w:tcPr>
-            <w:tcW w:type="dxa" w:w="10148"/>
-            <w:shd w:fill="F8EEE7"/>
-            <w:tcMar>
-              <w:top w:w="100" w:type="dxa"/>
-              <w:start w:w="140" w:type="dxa"/>
-              <w:bottom w:w="100" w:type="dxa"/>
-              <w:end w:w="140" w:type="dxa"/>
-            </w:tcMar>
-          </w:tcPr>
-          <w:p>
-            <w:pPr>
-              <w:spacing w:after="0"/>
-            </w:pPr>
-            <w:r>
-              <w:rPr>
-                <w:b/>
-                <w:color w:val="D97A4A"/>
-              </w:rPr>
-              <w:t>Schreibe einen Brief an die Schulleitung.</w:t>
-            </w:r>
-            <w:r>
-              <w:br/>
-              <w:t>• Wähle einen Wunsch aus der Umfrage.</w:t>
-            </w:r>
-            <w:r>
-              <w:br/>
-              <w:t>• Formuliere deinen Wunsch freundlich und verständlich.</w:t>
-            </w:r>
-            <w:r>
-              <w:br/>
-              <w:t>• Nenne mindestens einen passenden Satz dazu.</w:t>
-            </w:r>
-            <w:r>
-              <w:br/>
-              <w:t>• Du kannst ein Umfrageergebnis als zusätzlichen Grund verwenden.</w:t>
-            </w:r>
-            <w:r>
-              <w:br/>
-              <w:t>• Beende den Brief mit einer Grußformel und deinem Namen.</w:t>
-            </w:r>
-          </w:p>
-        </w:tc>
-      </w:tr>
-    </w:tbl>
-    <w:p>
-      <w:pPr>
-        <w:spacing w:before="60"/>
-      </w:pPr>
-      <w:r>
-        <w:rPr>
-          <w:b/>
-        </w:rPr>
-        <w:t xml:space="preserve">Arbeite in drei Schritten: </w:t>
-      </w:r>
-      <w:r>
-        <w:t>Planung → Durchführung → Reflexion</w:t>
-      </w:r>
-    </w:p>
-    <w:p>
-      <w:r>
-        <w:br w:type="page"/>
-      </w:r>
-    </w:p>
-    <w:p>
-      <w:pPr>
-        <w:pStyle w:val="Title"/>
-      </w:pPr>
-      <w:r>
-        <w:t>Planung: Mein Schreibplan</w:t>
-      </w:r>
-    </w:p>
-    <w:tbl>
-      <w:tblPr>
-        <w:tblW w:type="auto" w:w="0"/>
-        <w:jc w:val="center"/>
-        <w:tblLook w:firstColumn="1" w:firstRow="1" w:lastColumn="0" w:lastRow="0" w:noHBand="0" w:noVBand="1" w:val="04A0"/>
-      </w:tblPr>
-      <w:tblGrid>
-        <w:gridCol w:w="10148"/>
-      </w:tblGrid>
-      <w:tr>
-        <w:tc>
-          <w:tcPr>
-            <w:tcW w:type="dxa" w:w="10148"/>
-            <w:shd w:fill="EEF2F4"/>
-            <w:tcMar>
-              <w:top w:w="80" w:type="dxa"/>
-              <w:start w:w="110" w:type="dxa"/>
-              <w:bottom w:w="80" w:type="dxa"/>
-              <w:end w:w="110" w:type="dxa"/>
-            </w:tcMar>
-          </w:tcPr>
-          <w:p>
-            <w:pPr>
-              <w:spacing w:after="0"/>
-            </w:pPr>
-            <w:r>
-              <w:rPr>
-                <w:b/>
-                <w:color w:val="3E5668"/>
-                <w:sz w:val="21"/>
-              </w:rPr>
-              <w:t>Tipp</w:t>
-            </w:r>
-            <w:r>
-              <w:br/>
-              <w:t>Notiere nur Stichwörter. Der vollständige Brief kommt erst auf die nächste Seite.</w:t>
-            </w:r>
-          </w:p>
-        </w:tc>
-      </w:tr>
-    </w:tbl>
-    <w:p>
-      <w:pPr>
-        <w:spacing w:after="20"/>
-      </w:pPr>
-    </w:p>
-    <w:tbl>
-      <w:tblPr>
-        <w:tblStyle w:val="TableGrid"/>
-        <w:tblW w:type="auto" w:w="0"/>
-        <w:jc w:val="center"/>
-        <w:tblLook w:firstColumn="1" w:firstRow="1" w:lastColumn="0" w:lastRow="0" w:noHBand="0" w:noVBand="1" w:val="04A0"/>
-      </w:tblPr>
-      <w:tblGrid>
-        <w:gridCol w:w="5074"/>
-        <w:gridCol w:w="5074"/>
-      </w:tblGrid>
-      <w:tr>
-        <w:tc>
-          <w:tcPr>
-            <w:tcW w:type="dxa" w:w="5074"/>
-            <w:shd w:fill="DCE6EC"/>
-            <w:tcMar>
-              <w:top w:w="95" w:type="dxa"/>
-              <w:start w:w="100" w:type="dxa"/>
-              <w:bottom w:w="95" w:type="dxa"/>
-              <w:end w:w="100" w:type="dxa"/>
-            </w:tcMar>
-          </w:tcPr>
-          <w:p>
-            <w:r>
-              <w:rPr>
-                <w:b/>
-                <w:color w:val="3E5668"/>
-                <w:sz w:val="18"/>
-              </w:rPr>
-              <w:t>An wen schreibe ich?</w:t>
-            </w:r>
-          </w:p>
-        </w:tc>
-        <w:tc>
-          <w:tcPr>
-            <w:tcW w:type="dxa" w:w="5074"/>
-            <w:tcMar>
-              <w:top w:w="95" w:type="dxa"/>
-              <w:start w:w="100" w:type="dxa"/>
-              <w:bottom w:w="95" w:type="dxa"/>
-              <w:end w:w="100" w:type="dxa"/>
-            </w:tcMar>
-          </w:tcPr>
-          <w:p>
-            <w:r>
-              <w:t>Schulleitung</w:t>
-              <w:br/>
-            </w:r>
-          </w:p>
-        </w:tc>
-      </w:tr>
-      <w:tr>
-        <w:tc>
-          <w:tcPr>
-            <w:tcW w:type="dxa" w:w="5074"/>
-            <w:shd w:fill="DCE6EC"/>
-            <w:tcMar>
-              <w:top w:w="95" w:type="dxa"/>
-              <w:start w:w="100" w:type="dxa"/>
-              <w:bottom w:w="95" w:type="dxa"/>
-              <w:end w:w="100" w:type="dxa"/>
-            </w:tcMar>
-          </w:tcPr>
-          <w:p>
-            <w:r>
-              <w:rPr>
-                <w:b/>
-                <w:color w:val="3E5668"/>
-                <w:sz w:val="18"/>
-              </w:rPr>
-              <w:t>Welchen Wunsch wähle ich?</w:t>
-            </w:r>
-          </w:p>
-        </w:tc>
-        <w:tc>
-          <w:tcPr>
-            <w:tcW w:type="dxa" w:w="5074"/>
-            <w:tcMar>
-              <w:top w:w="95" w:type="dxa"/>
-              <w:start w:w="100" w:type="dxa"/>
-              <w:bottom w:w="95" w:type="dxa"/>
-              <w:end w:w="100" w:type="dxa"/>
-            </w:tcMar>
-          </w:tcPr>
-          <w:p>
-            <w:r>
-              <w:br/>
-            </w:r>
-          </w:p>
-        </w:tc>
-      </w:tr>
-      <w:tr>
-        <w:tc>
-          <w:tcPr>
-            <w:tcW w:type="dxa" w:w="5074"/>
-            <w:shd w:fill="DCE6EC"/>
-            <w:tcMar>
-              <w:top w:w="95" w:type="dxa"/>
-              <w:start w:w="100" w:type="dxa"/>
-              <w:bottom w:w="95" w:type="dxa"/>
-              <w:end w:w="100" w:type="dxa"/>
-            </w:tcMar>
-          </w:tcPr>
-          <w:p>
-            <w:r>
-              <w:rPr>
-                <w:b/>
-                <w:color w:val="3E5668"/>
-                <w:sz w:val="18"/>
-              </w:rPr>
-              <w:t>Warum ist dieser Wunsch sinnvoll?</w:t>
-            </w:r>
-          </w:p>
-        </w:tc>
-        <w:tc>
-          <w:tcPr>
-            <w:tcW w:type="dxa" w:w="5074"/>
-            <w:tcMar>
-              <w:top w:w="95" w:type="dxa"/>
-              <w:start w:w="100" w:type="dxa"/>
-              <w:bottom w:w="95" w:type="dxa"/>
-              <w:end w:w="100" w:type="dxa"/>
-            </w:tcMar>
-          </w:tcPr>
-          <w:p>
-            <w:r>
-              <w:br/>
-            </w:r>
-          </w:p>
-        </w:tc>
-      </w:tr>
-      <w:tr>
-        <w:tc>
-          <w:tcPr>
-            <w:tcW w:type="dxa" w:w="5074"/>
-            <w:shd w:fill="DCE6EC"/>
-            <w:tcMar>
-              <w:top w:w="95" w:type="dxa"/>
-              <w:start w:w="100" w:type="dxa"/>
-              <w:bottom w:w="95" w:type="dxa"/>
-              <w:end w:w="100" w:type="dxa"/>
-            </w:tcMar>
-          </w:tcPr>
-          <w:p>
-            <w:r>
-              <w:rPr>
-                <w:b/>
-                <w:color w:val="3E5668"/>
-                <w:sz w:val="18"/>
-              </w:rPr>
-              <w:t>Welches Umfrageergebnis passt dazu?</w:t>
-            </w:r>
-          </w:p>
-        </w:tc>
-        <w:tc>
-          <w:tcPr>
-            <w:tcW w:type="dxa" w:w="5074"/>
-            <w:tcMar>
-              <w:top w:w="95" w:type="dxa"/>
-              <w:start w:w="100" w:type="dxa"/>
-              <w:bottom w:w="95" w:type="dxa"/>
-              <w:end w:w="100" w:type="dxa"/>
-            </w:tcMar>
-          </w:tcPr>
-          <w:p>
-            <w:r>
-              <w:br/>
-            </w:r>
-          </w:p>
-        </w:tc>
-      </w:tr>
-      <w:tr>
-        <w:tc>
-          <w:tcPr>
-            <w:tcW w:type="dxa" w:w="5074"/>
-            <w:shd w:fill="DCE6EC"/>
-            <w:tcMar>
-              <w:top w:w="95" w:type="dxa"/>
-              <w:start w:w="100" w:type="dxa"/>
-              <w:bottom w:w="95" w:type="dxa"/>
-              <w:end w:w="100" w:type="dxa"/>
-            </w:tcMar>
-          </w:tcPr>
-          <w:p>
-            <w:r>
-              <w:rPr>
-                <w:b/>
-                <w:color w:val="3E5668"/>
-                <w:sz w:val="18"/>
-              </w:rPr>
-              <w:t>Wie formuliere ich das Ergebnis in einem Satz?</w:t>
-            </w:r>
-          </w:p>
-        </w:tc>
-        <w:tc>
-          <w:tcPr>
-            <w:tcW w:type="dxa" w:w="5074"/>
-            <w:tcMar>
-              <w:top w:w="95" w:type="dxa"/>
-              <w:start w:w="100" w:type="dxa"/>
-              <w:bottom w:w="95" w:type="dxa"/>
-              <w:end w:w="100" w:type="dxa"/>
-            </w:tcMar>
-          </w:tcPr>
-          <w:p>
-            <w:r>
-              <w:br/>
-            </w:r>
-          </w:p>
-        </w:tc>
-      </w:tr>
-      <w:tr>
-        <w:tc>
-          <w:tcPr>
-            <w:tcW w:type="dxa" w:w="5074"/>
-            <w:shd w:fill="DCE6EC"/>
-            <w:tcMar>
-              <w:top w:w="95" w:type="dxa"/>
-              <w:start w:w="100" w:type="dxa"/>
-              <w:bottom w:w="95" w:type="dxa"/>
-              <w:end w:w="100" w:type="dxa"/>
-            </w:tcMar>
-          </w:tcPr>
-          <w:p>
-            <w:r>
-              <w:rPr>
-                <w:b/>
-                <w:color w:val="3E5668"/>
-                <w:sz w:val="18"/>
-              </w:rPr>
-              <w:t>Welche Anrede nutze ich?</w:t>
-            </w:r>
-          </w:p>
-        </w:tc>
-        <w:tc>
-          <w:tcPr>
-            <w:tcW w:type="dxa" w:w="5074"/>
-            <w:tcMar>
-              <w:top w:w="95" w:type="dxa"/>
-              <w:start w:w="100" w:type="dxa"/>
-              <w:bottom w:w="95" w:type="dxa"/>
-              <w:end w:w="100" w:type="dxa"/>
-            </w:tcMar>
-          </w:tcPr>
-          <w:p>
-            <w:r>
-              <w:br/>
-            </w:r>
-          </w:p>
-        </w:tc>
-      </w:tr>
-      <w:tr>
-        <w:tc>
-          <w:tcPr>
-            <w:tcW w:type="dxa" w:w="5074"/>
-            <w:shd w:fill="DCE6EC"/>
-            <w:tcMar>
-              <w:top w:w="95" w:type="dxa"/>
-              <w:start w:w="100" w:type="dxa"/>
-              <w:bottom w:w="95" w:type="dxa"/>
-              <w:end w:w="100" w:type="dxa"/>
-            </w:tcMar>
-          </w:tcPr>
-          <w:p>
-            <w:r>
-              <w:rPr>
-                <w:b/>
-                <w:color w:val="3E5668"/>
-                <w:sz w:val="18"/>
-              </w:rPr>
-              <w:t>Welche Grußformel nutze ich?</w:t>
-            </w:r>
-          </w:p>
-        </w:tc>
-        <w:tc>
-          <w:tcPr>
-            <w:tcW w:type="dxa" w:w="5074"/>
-            <w:tcMar>
-              <w:top w:w="95" w:type="dxa"/>
-              <w:start w:w="100" w:type="dxa"/>
-              <w:bottom w:w="95" w:type="dxa"/>
-              <w:end w:w="100" w:type="dxa"/>
-            </w:tcMar>
-          </w:tcPr>
-          <w:p>
-            <w:r>
-              <w:br/>
-            </w:r>
-          </w:p>
-        </w:tc>
-      </w:tr>
-    </w:tbl>
-    <w:p>
-      <w:pPr>
-        <w:spacing w:after="0"/>
-      </w:pPr>
-    </w:p>
-    <w:tbl>
-      <w:tblPr>
-        <w:tblW w:type="auto" w:w="0"/>
-        <w:jc w:val="center"/>
-        <w:tblLook w:firstColumn="1" w:firstRow="1" w:lastColumn="0" w:lastRow="0" w:noHBand="0" w:noVBand="1" w:val="04A0"/>
-      </w:tblPr>
-      <w:tblGrid>
-        <w:gridCol w:w="10148"/>
-      </w:tblGrid>
-      <w:tr>
-        <w:tc>
-          <w:tcPr>
-            <w:tcW w:type="dxa" w:w="10148"/>
-            <w:shd w:fill="EDF5EA"/>
-            <w:tcMar>
-              <w:top w:w="80" w:type="dxa"/>
-              <w:start w:w="110" w:type="dxa"/>
-              <w:bottom w:w="80" w:type="dxa"/>
-              <w:end w:w="110" w:type="dxa"/>
-            </w:tcMar>
-          </w:tcPr>
-          <w:p>
-            <w:pPr>
-              <w:spacing w:after="0"/>
-            </w:pPr>
-            <w:r>
-              <w:rPr>
-                <w:b/>
-                <w:color w:val="4D8B3F"/>
-                <w:sz w:val="21"/>
-              </w:rPr>
-              <w:t>Mein Ziel für die Probearbeit</w:t>
-            </w:r>
-            <w:r>
-              <w:br/>
-              <w:t>Ich möchte heute besonders darauf achten, dass …</w:t>
-              <w:br/>
-              <w:br/>
-              <w:t>____________________________________________________________</w:t>
-            </w:r>
-          </w:p>
-        </w:tc>
-      </w:tr>
-    </w:tbl>
-    <w:p>
-      <w:pPr>
-        <w:spacing w:after="0"/>
-      </w:pPr>
-    </w:p>
-    <w:p>
-      <w:r>
-        <w:br w:type="page"/>
-      </w:r>
-    </w:p>
-    <w:p>
-      <w:pPr>
-        <w:pStyle w:val="Title"/>
-      </w:pPr>
-      <w:r>
-        <w:t>Durchführung: Mein Wunschbrief</w:t>
-      </w:r>
-    </w:p>
-    <w:p>
-      <w:pPr>
-        <w:spacing w:after="100"/>
-      </w:pPr>
-      <w:r>
-        <w:rPr>
-          <w:b/>
-        </w:rPr>
-        <w:t xml:space="preserve">Name: </w:t>
-      </w:r>
-      <w:r>
-        <w:t>______________________________</w:t>
-      </w:r>
-      <w:r>
-        <w:rPr>
-          <w:b/>
-        </w:rPr>
-        <w:t xml:space="preserve">    Datum: </w:t>
-      </w:r>
-      <w:r>
-        <w:t>__________________</w:t>
-      </w:r>
-    </w:p>
-    <w:p>
-      <w:pPr>
-        <w:spacing w:after="60" w:line="240" w:lineRule="auto"/>
-      </w:pPr>
-      <w:r>
-        <w:t>____________________________________________________________________________________________________</w:t>
-      </w:r>
-    </w:p>
-    <w:p>
-      <w:pPr>
-        <w:spacing w:after="60" w:line="240" w:lineRule="auto"/>
-      </w:pPr>
-      <w:r>
-        <w:t>____________________________________________________________________________________________________</w:t>
-      </w:r>
-    </w:p>
-    <w:p>
-      <w:pPr>
-        <w:spacing w:after="60" w:line="240" w:lineRule="auto"/>
-      </w:pPr>
-      <w:r>
-        <w:t>____________________________________________________________________________________________________</w:t>
-      </w:r>
-    </w:p>
-    <w:p>
-      <w:pPr>
-        <w:spacing w:after="60" w:line="240" w:lineRule="auto"/>
-      </w:pPr>
-      <w:r>
-        <w:t>____________________________________________________________________________________________________</w:t>
-      </w:r>
-    </w:p>
-    <w:p>
-      <w:pPr>
-        <w:spacing w:after="60" w:line="240" w:lineRule="auto"/>
-      </w:pPr>
-      <w:r>
-        <w:t>____________________________________________________________________________________________________</w:t>
-      </w:r>
-    </w:p>
-    <w:p>
-      <w:pPr>
-        <w:spacing w:after="60" w:line="240" w:lineRule="auto"/>
-      </w:pPr>
-      <w:r>
-        <w:t>____________________________________________________________________________________________________</w:t>
-      </w:r>
-    </w:p>
-    <w:p>
-      <w:pPr>
-        <w:spacing w:after="60" w:line="240" w:lineRule="auto"/>
-      </w:pPr>
-      <w:r>
-        <w:t>____________________________________________________________________________________________________</w:t>
-      </w:r>
-    </w:p>
-    <w:p>
-      <w:pPr>
-        <w:spacing w:after="60" w:line="240" w:lineRule="auto"/>
-      </w:pPr>
-      <w:r>
-        <w:t>____________________________________________________________________________________________________</w:t>
-      </w:r>
-    </w:p>
-    <w:p>
-      <w:pPr>
-        <w:spacing w:after="60" w:line="240" w:lineRule="auto"/>
-      </w:pPr>
-      <w:r>
-        <w:t>____________________________________________________________________________________________________</w:t>
-      </w:r>
-    </w:p>
-    <w:p>
-      <w:pPr>
-        <w:spacing w:after="60" w:line="240" w:lineRule="auto"/>
-      </w:pPr>
-      <w:r>
-        <w:t>____________________________________________________________________________________________________</w:t>
-      </w:r>
-    </w:p>
-    <w:p>
-      <w:pPr>
-        <w:spacing w:after="60" w:line="240" w:lineRule="auto"/>
-      </w:pPr>
-      <w:r>
-        <w:t>____________________________________________________________________________________________________</w:t>
-      </w:r>
-    </w:p>
-    <w:p>
-      <w:pPr>
-        <w:spacing w:after="60" w:line="240" w:lineRule="auto"/>
-      </w:pPr>
-      <w:r>
-        <w:t>____________________________________________________________________________________________________</w:t>
-      </w:r>
-    </w:p>
-    <w:p>
-      <w:pPr>
-        <w:spacing w:after="60" w:line="240" w:lineRule="auto"/>
-      </w:pPr>
-      <w:r>
-        <w:t>____________________________________________________________________________________________________</w:t>
-      </w:r>
-    </w:p>
-    <w:p>
-      <w:pPr>
-        <w:spacing w:after="60" w:line="240" w:lineRule="auto"/>
-      </w:pPr>
-      <w:r>
-        <w:t>____________________________________________________________________________________________________</w:t>
-      </w:r>
-    </w:p>
-    <w:p>
-      <w:pPr>
-        <w:spacing w:after="60" w:line="240" w:lineRule="auto"/>
-      </w:pPr>
-      <w:r>
-        <w:t>____________________________________________________________________________________________________</w:t>
-      </w:r>
-    </w:p>
-    <w:p>
-      <w:pPr>
-        <w:spacing w:after="60" w:line="240" w:lineRule="auto"/>
-      </w:pPr>
-      <w:r>
-        <w:t>____________________________________________________________________________________________________</w:t>
-      </w:r>
-    </w:p>
-    <w:p>
-      <w:pPr>
-        <w:spacing w:after="60" w:line="240" w:lineRule="auto"/>
-      </w:pPr>
-      <w:r>
-        <w:t>____________________________________________________________________________________________________</w:t>
-      </w:r>
-    </w:p>
-    <w:p>
-      <w:r>
-        <w:br w:type="page"/>
-      </w:r>
-    </w:p>
-    <w:p>
-      <w:pPr>
-        <w:pStyle w:val="Title"/>
-      </w:pPr>
-      <w:r>
-        <w:t>Reflexion: Ich prüfe meinen Brief</w:t>
-      </w:r>
-    </w:p>
-    <w:p>
-      <w:pPr>
-        <w:pStyle w:val="Heading1"/>
-      </w:pPr>
-      <w:r>
-        <w:t>Checkliste</w:t>
-      </w:r>
-    </w:p>
-    <w:p>
-      <w:pPr>
-        <w:spacing w:after="40"/>
-      </w:pPr>
-      <w:r>
-        <w:rPr>
-          <w:b/>
-        </w:rPr>
-        <w:t xml:space="preserve">☐ </w:t>
-      </w:r>
-      <w:r>
-        <w:t>Ich habe Ort und Datum notiert.</w:t>
-      </w:r>
-    </w:p>
-    <w:p>
-      <w:pPr>
-        <w:spacing w:after="40"/>
-      </w:pPr>
-      <w:r>
-        <w:rPr>
-          <w:b/>
-        </w:rPr>
-        <w:t xml:space="preserve">☐ </w:t>
-      </w:r>
-      <w:r>
-        <w:t>Ich habe eine passende Anrede verwendet.</w:t>
-      </w:r>
-    </w:p>
-    <w:p>
-      <w:pPr>
-        <w:spacing w:after="40"/>
-      </w:pPr>
-      <w:r>
-        <w:rPr>
-          <w:b/>
-        </w:rPr>
-        <w:t xml:space="preserve">☐ </w:t>
-      </w:r>
-      <w:r>
-        <w:t>Mein Wunsch ist deutlich und verständlich.</w:t>
-      </w:r>
-    </w:p>
-    <w:p>
-      <w:pPr>
-        <w:spacing w:after="40"/>
-      </w:pPr>
-      <w:r>
-        <w:rPr>
-          <w:b/>
-        </w:rPr>
-        <w:t xml:space="preserve">☐ </w:t>
-      </w:r>
-      <w:r>
-        <w:t>Ich habe freundlich geschrieben.</w:t>
-      </w:r>
-    </w:p>
-    <w:p>
-      <w:pPr>
-        <w:spacing w:after="40"/>
-      </w:pPr>
-      <w:r>
-        <w:rPr>
-          <w:b/>
-        </w:rPr>
-        <w:t xml:space="preserve">☐ </w:t>
-      </w:r>
-      <w:r>
-        <w:t>Ich habe mindestens einen passenden Satz zu meinem Wunsch geschrieben.</w:t>
-      </w:r>
-    </w:p>
-    <w:p>
-      <w:pPr>
-        <w:spacing w:after="40"/>
-      </w:pPr>
-      <w:r>
-        <w:rPr>
-          <w:b/>
-        </w:rPr>
-        <w:t xml:space="preserve">☐ </w:t>
-      </w:r>
-      <w:r>
-        <w:t>Ich habe eine Grußformel und meinen Namen geschrieben.</w:t>
-      </w:r>
-    </w:p>
-    <w:p>
-      <w:pPr>
-        <w:spacing w:after="40"/>
-      </w:pPr>
-      <w:r>
-        <w:rPr>
-          <w:b/>
-        </w:rPr>
-        <w:t xml:space="preserve">☐ </w:t>
-      </w:r>
-      <w:r>
-        <w:t>Mein Brief ist gut lesbar.</w:t>
-      </w:r>
-    </w:p>
-    <w:p>
-      <w:pPr>
-        <w:spacing w:after="40"/>
-      </w:pPr>
-      <w:r>
-        <w:rPr>
-          <w:b/>
-        </w:rPr>
-        <w:t xml:space="preserve">☐ </w:t>
-      </w:r>
-      <w:r>
-        <w:t>Wenn ich eine Zahl verwendet habe: Ich habe sie richtig übernommen und erklärt.</w:t>
-      </w:r>
-    </w:p>
-    <w:p>
-      <w:pPr>
-        <w:pStyle w:val="Heading1"/>
-      </w:pPr>
-      <w:r>
-        <w:t>Mein Rückblick</w:t>
-      </w:r>
-    </w:p>
-    <w:p>
-      <w:pPr>
-        <w:spacing w:after="20"/>
-      </w:pPr>
-      <w:r>
-        <w:rPr>
-          <w:b/>
-          <w:color w:val="3E5668"/>
-        </w:rPr>
-        <w:t>Das ist mir gut gelungen:</w:t>
-      </w:r>
-    </w:p>
-    <w:p>
-      <w:pPr>
-        <w:spacing w:after="80"/>
-      </w:pPr>
-      <w:r>
-        <w:t>________________________________________________________________________________________________</w:t>
-      </w:r>
-    </w:p>
-    <w:p>
-      <w:pPr>
-        <w:spacing w:after="20"/>
-      </w:pPr>
-      <w:r>
-        <w:rPr>
-          <w:b/>
-          <w:color w:val="3E5668"/>
-        </w:rPr>
-        <w:t>Dabei war ich noch unsicher:</w:t>
-      </w:r>
-    </w:p>
-    <w:p>
-      <w:pPr>
-        <w:spacing w:after="80"/>
-      </w:pPr>
-      <w:r>
-        <w:t>________________________________________________________________________________________________</w:t>
-      </w:r>
-    </w:p>
-    <w:p>
-      <w:pPr>
-        <w:spacing w:after="20"/>
-      </w:pPr>
-      <w:r>
-        <w:rPr>
-          <w:b/>
-          <w:color w:val="3E5668"/>
-        </w:rPr>
-        <w:t>Vor der Arbeit möchte ich noch üben:</w:t>
-      </w:r>
-    </w:p>
-    <w:p>
-      <w:pPr>
-        <w:spacing w:after="80"/>
-      </w:pPr>
-      <w:r>
-        <w:t>________________________________________________________________________________________________</w:t>
+        <w:t>Wenn du einen Anfang brauchst:</w:t>
       </w:r>
     </w:p>
     <w:p>
       <w:r>
         <w:rPr>
-          <w:b/>
+          <w:b w:val="0"/>
         </w:rPr>
-        <w:t xml:space="preserve">So bereit fühle ich mich:  </w:t>
-      </w:r>
-      <w:r>
-        <w:t>☐ noch nicht   ☐ fast bereit   ☐ bereit</w:t>
+        <w:t>Sehr geehrte Frau …, / Sehr geehrter Herr …,</w:t>
+        <w:br/>
+        <w:t>Für unsere Schule wünsche ich mir …</w:t>
+        <w:br/>
+        <w:t>Ich würde mich darüber sehr freuen.</w:t>
+        <w:br/>
+        <w:t>Freundliche Grüße</w:t>
       </w:r>
     </w:p>
     <w:p>
       <w:r>
-        <w:br w:type="page"/>
+        <w:rPr>
+          <w:b w:val="0"/>
+        </w:rPr>
+        <w:t>Nur wenn du einen Zusatz schreiben möchtest:</w:t>
+        <w:br/>
+        <w:t>Das wäre sinnvoll, weil …</w:t>
+        <w:br/>
+        <w:t>In der Umfrage wünschen sich … Kinder …</w:t>
       </w:r>
     </w:p>
     <w:p>
       <w:pPr>
-        <w:pStyle w:val="Title"/>
+        <w:pStyle w:val="Heading2"/>
+      </w:pPr>
+      <w:r>
+        <w:t>Reflexion</w:t>
+      </w:r>
+    </w:p>
+    <w:p>
+      <w:r>
+        <w:rPr>
+          <w:b w:val="0"/>
+        </w:rPr>
+        <w:t>Lies deinen Brief. Prüfe die Punkte unter „Das gehört in deinen Brief“. Verbessere eine Stelle, wenn es nötig ist.</w:t>
+      </w:r>
+    </w:p>
+    <w:p>
+      <w:r>
+        <w:rPr>
+          <w:b w:val="0"/>
+        </w:rPr>
+        <w:t>Du darfst dir den Auftrag vorlesen lassen. Deinen Brief formulierst du selbst. Während der Arbeit nutzt du keine Hilfe von anderen Kindern und keinen Kiosk.</w:t>
+      </w:r>
+    </w:p>
+    <w:p>
+      <w:pPr>
+        <w:pStyle w:val="ExamTitle"/>
+        <w:pageBreakBefore/>
       </w:pPr>
       <w:r>
         <w:t>Rückmeldung zur Probearbeit</w:t>
@@ -1618,381 +1444,276 @@
     </w:p>
     <w:p>
       <w:pPr>
-        <w:spacing w:after="100"/>
+        <w:pStyle w:val="ExamBody"/>
       </w:pPr>
       <w:r>
-        <w:rPr>
-          <w:b/>
-        </w:rPr>
-        <w:t xml:space="preserve">Name: </w:t>
-      </w:r>
-      <w:r>
-        <w:t>______________________________</w:t>
-      </w:r>
-      <w:r>
-        <w:rPr>
-          <w:b/>
-        </w:rPr>
-        <w:t xml:space="preserve">    Datum: </w:t>
-      </w:r>
-      <w:r>
-        <w:t>__________________</w:t>
+        <w:t>Name: __________________________  Datum: ______________</w:t>
       </w:r>
     </w:p>
     <w:p>
       <w:pPr>
-        <w:pStyle w:val="Heading1"/>
+        <w:pStyle w:val="ExamBody"/>
       </w:pPr>
       <w:r>
-        <w:t>Das gelingt bereits</w:t>
-      </w:r>
-    </w:p>
-    <w:tbl>
-      <w:tblPr>
-        <w:tblStyle w:val="TableGrid"/>
-        <w:tblW w:type="auto" w:w="0"/>
-        <w:jc w:val="center"/>
-        <w:tblLook w:firstColumn="1" w:firstRow="1" w:lastColumn="0" w:lastRow="0" w:noHBand="0" w:noVBand="1" w:val="04A0"/>
-      </w:tblPr>
-      <w:tblGrid>
-        <w:gridCol w:w="5074"/>
-        <w:gridCol w:w="5074"/>
-      </w:tblGrid>
-      <w:tr>
-        <w:tc>
-          <w:tcPr>
-            <w:tcW w:type="dxa" w:w="5074"/>
-            <w:shd w:fill="DCE6EC"/>
-          </w:tcPr>
-          <w:p>
-            <w:pPr>
-              <w:spacing w:after="0"/>
-            </w:pPr>
-            <w:r>
-              <w:rPr>
-                <w:b/>
-                <w:sz w:val="17"/>
-              </w:rPr>
-              <w:t>Schreibsituation verstanden</w:t>
-            </w:r>
-          </w:p>
-        </w:tc>
-        <w:tc>
-          <w:tcPr>
-            <w:tcW w:type="dxa" w:w="5074"/>
-          </w:tcPr>
-          <w:p>
-            <w:pPr>
-              <w:spacing w:after="0"/>
-            </w:pPr>
-            <w:r>
-              <w:rPr>
-                <w:sz w:val="17"/>
-              </w:rPr>
-              <w:t>☐ sicher  ☐ teilweise  ☐ noch nicht</w:t>
-            </w:r>
-          </w:p>
-        </w:tc>
-      </w:tr>
-      <w:tr>
-        <w:tc>
-          <w:tcPr>
-            <w:tcW w:type="dxa" w:w="5074"/>
-            <w:shd w:fill="DCE6EC"/>
-          </w:tcPr>
-          <w:p>
-            <w:pPr>
-              <w:spacing w:after="0"/>
-            </w:pPr>
-            <w:r>
-              <w:rPr>
-                <w:b/>
-                <w:sz w:val="17"/>
-              </w:rPr>
-              <w:t>Brief vollständig aufgebaut</w:t>
-            </w:r>
-          </w:p>
-        </w:tc>
-        <w:tc>
-          <w:tcPr>
-            <w:tcW w:type="dxa" w:w="5074"/>
-          </w:tcPr>
-          <w:p>
-            <w:pPr>
-              <w:spacing w:after="0"/>
-            </w:pPr>
-            <w:r>
-              <w:rPr>
-                <w:sz w:val="17"/>
-              </w:rPr>
-              <w:t>☐ sicher  ☐ teilweise  ☐ noch nicht</w:t>
-            </w:r>
-          </w:p>
-        </w:tc>
-      </w:tr>
-      <w:tr>
-        <w:tc>
-          <w:tcPr>
-            <w:tcW w:type="dxa" w:w="5074"/>
-            <w:shd w:fill="DCE6EC"/>
-          </w:tcPr>
-          <w:p>
-            <w:pPr>
-              <w:spacing w:after="0"/>
-            </w:pPr>
-            <w:r>
-              <w:rPr>
-                <w:b/>
-                <w:sz w:val="17"/>
-              </w:rPr>
-              <w:t>Wunsch freundlich und verständlich formuliert</w:t>
-            </w:r>
-          </w:p>
-        </w:tc>
-        <w:tc>
-          <w:tcPr>
-            <w:tcW w:type="dxa" w:w="5074"/>
-          </w:tcPr>
-          <w:p>
-            <w:pPr>
-              <w:spacing w:after="0"/>
-            </w:pPr>
-            <w:r>
-              <w:rPr>
-                <w:sz w:val="17"/>
-              </w:rPr>
-              <w:t>☐ sicher  ☐ teilweise  ☐ noch nicht</w:t>
-            </w:r>
-          </w:p>
-        </w:tc>
-      </w:tr>
-      <w:tr>
-        <w:tc>
-          <w:tcPr>
-            <w:tcW w:type="dxa" w:w="5074"/>
-            <w:shd w:fill="DCE6EC"/>
-          </w:tcPr>
-          <w:p>
-            <w:pPr>
-              <w:spacing w:after="0"/>
-            </w:pPr>
-            <w:r>
-              <w:rPr>
-                <w:b/>
-                <w:sz w:val="17"/>
-              </w:rPr>
-              <w:t>Passenden Grund genannt</w:t>
-            </w:r>
-          </w:p>
-        </w:tc>
-        <w:tc>
-          <w:tcPr>
-            <w:tcW w:type="dxa" w:w="5074"/>
-          </w:tcPr>
-          <w:p>
-            <w:pPr>
-              <w:spacing w:after="0"/>
-            </w:pPr>
-            <w:r>
-              <w:rPr>
-                <w:sz w:val="17"/>
-              </w:rPr>
-              <w:t>☐ sicher  ☐ teilweise  ☐ noch nicht</w:t>
-            </w:r>
-          </w:p>
-        </w:tc>
-      </w:tr>
-      <w:tr>
-        <w:tc>
-          <w:tcPr>
-            <w:tcW w:type="dxa" w:w="5074"/>
-            <w:shd w:fill="DCE6EC"/>
-          </w:tcPr>
-          <w:p>
-            <w:pPr>
-              <w:spacing w:after="0"/>
-            </w:pPr>
-            <w:r>
-              <w:rPr>
-                <w:b/>
-                <w:sz w:val="17"/>
-              </w:rPr>
-              <w:t>Umfrageergebnis passend verwendet</w:t>
-            </w:r>
-          </w:p>
-        </w:tc>
-        <w:tc>
-          <w:tcPr>
-            <w:tcW w:type="dxa" w:w="5074"/>
-          </w:tcPr>
-          <w:p>
-            <w:pPr>
-              <w:spacing w:after="0"/>
-            </w:pPr>
-            <w:r>
-              <w:rPr>
-                <w:sz w:val="17"/>
-              </w:rPr>
-              <w:t>☐ sicher  ☐ teilweise  ☐ nicht genutzt</w:t>
-            </w:r>
-          </w:p>
-        </w:tc>
-      </w:tr>
-      <w:tr>
-        <w:tc>
-          <w:tcPr>
-            <w:tcW w:type="dxa" w:w="5074"/>
-            <w:shd w:fill="DCE6EC"/>
-          </w:tcPr>
-          <w:p>
-            <w:pPr>
-              <w:spacing w:after="0"/>
-            </w:pPr>
-            <w:r>
-              <w:rPr>
-                <w:b/>
-                <w:sz w:val="17"/>
-              </w:rPr>
-              <w:t>Brief selbstständig kontrolliert</w:t>
-            </w:r>
-          </w:p>
-        </w:tc>
-        <w:tc>
-          <w:tcPr>
-            <w:tcW w:type="dxa" w:w="5074"/>
-          </w:tcPr>
-          <w:p>
-            <w:pPr>
-              <w:spacing w:after="0"/>
-            </w:pPr>
-            <w:r>
-              <w:rPr>
-                <w:sz w:val="17"/>
-              </w:rPr>
-              <w:t>☐ sicher  ☐ teilweise  ☐ noch nicht</w:t>
-            </w:r>
-          </w:p>
-        </w:tc>
-      </w:tr>
-    </w:tbl>
-    <w:p>
-      <w:pPr>
-        <w:pStyle w:val="Heading1"/>
-      </w:pPr>
-      <w:r>
-        <w:t>Dein nächster Lernschritt</w:t>
+        <w:t>Die Lehrkraft füllt diesen Bogen mit dir aus. Er ist keine Note.</w:t>
       </w:r>
     </w:p>
     <w:p>
       <w:pPr>
-        <w:spacing w:after="60"/>
+        <w:pStyle w:val="ExamBody"/>
       </w:pPr>
       <w:r>
-        <w:t>__________________________________________________________________________________________________</w:t>
+        <w:t>Betrachteter Text: ☐ erste Fassung  ☐ unterstützte Überarbeitung</w:t>
       </w:r>
     </w:p>
     <w:p>
       <w:pPr>
-        <w:spacing w:after="60"/>
+        <w:pStyle w:val="ExamHeading"/>
       </w:pPr>
       <w:r>
-        <w:t>__________________________________________________________________________________________________</w:t>
+        <w:t>Das zeigt dein Brief</w:t>
       </w:r>
     </w:p>
     <w:p>
       <w:pPr>
-        <w:spacing w:after="60"/>
+        <w:pStyle w:val="ExamBody"/>
       </w:pPr>
       <w:r>
-        <w:t>__________________________________________________________________________________________________</w:t>
+        <w:t>Die Anrede passt zur Person.</w:t>
       </w:r>
     </w:p>
     <w:p>
       <w:pPr>
-        <w:pStyle w:val="Heading1"/>
+        <w:pStyle w:val="ExamBody"/>
       </w:pPr>
       <w:r>
-        <w:t>Empfehlung für das Prüfungsfenster</w:t>
+        <w:t>☐ gelungen   ☐ noch üben</w:t>
       </w:r>
     </w:p>
     <w:p>
       <w:pPr>
-        <w:spacing w:after="40"/>
+        <w:pStyle w:val="ExamBody"/>
       </w:pPr>
       <w:r>
-        <w:t>☐ Du kannst deinen Prüfungstermin auswählen.</w:t>
+        <w:t>Dein Wunsch passt zum Auftrag und ist verständlich.</w:t>
       </w:r>
     </w:p>
     <w:p>
       <w:pPr>
-        <w:spacing w:after="40"/>
+        <w:pStyle w:val="ExamBody"/>
       </w:pPr>
       <w:r>
-        <w:t>☐ Übe vorher noch einen Bereich gezielt.</w:t>
+        <w:t>☐ gelungen   ☐ noch üben</w:t>
       </w:r>
     </w:p>
     <w:p>
       <w:pPr>
-        <w:spacing w:after="40"/>
+        <w:pStyle w:val="ExamBody"/>
       </w:pPr>
       <w:r>
-        <w:t>☐ Führe vor der Terminwahl ein kurzes Gespräch mit einer Lehrkraft.</w:t>
+        <w:t>Ein weiterer Satz passt zu deinem Wunsch.</w:t>
       </w:r>
     </w:p>
-    <w:tbl>
-      <w:tblPr>
-        <w:tblW w:type="auto" w:w="0"/>
-        <w:jc w:val="center"/>
-        <w:tblLook w:firstColumn="1" w:firstRow="1" w:lastColumn="0" w:lastRow="0" w:noHBand="0" w:noVBand="1" w:val="04A0"/>
-      </w:tblPr>
-      <w:tblGrid>
-        <w:gridCol w:w="10148"/>
-      </w:tblGrid>
-      <w:tr>
-        <w:tc>
-          <w:tcPr>
-            <w:tcW w:type="dxa" w:w="10148"/>
-            <w:shd w:fill="EEF2F4"/>
-            <w:tcMar>
-              <w:top w:w="80" w:type="dxa"/>
-              <w:start w:w="110" w:type="dxa"/>
-              <w:bottom w:w="80" w:type="dxa"/>
-              <w:end w:w="110" w:type="dxa"/>
-            </w:tcMar>
-          </w:tcPr>
-          <w:p>
-            <w:pPr>
-              <w:spacing w:after="0"/>
-            </w:pPr>
-            <w:r>
-              <w:rPr>
-                <w:b/>
-                <w:color w:val="3E5668"/>
-                <w:sz w:val="21"/>
-              </w:rPr>
-              <w:t>Passender Übungsweg</w:t>
-            </w:r>
-            <w:r>
-              <w:br/>
-              <w:t>Briefaufbau: Blatt 7–10 · Wünsche formulieren: Blatt 11–13 · Gründe und Daten: Blatt 14 und 20 · Planen und Schreiben: Blatt 16–18</w:t>
-            </w:r>
-          </w:p>
-        </w:tc>
-      </w:tr>
-    </w:tbl>
     <w:p>
       <w:pPr>
-        <w:spacing w:after="0"/>
+        <w:pStyle w:val="ExamBody"/>
       </w:pPr>
+      <w:r>
+        <w:t>☐ gelungen   ☐ noch üben</w:t>
+      </w:r>
+    </w:p>
+    <w:p>
+      <w:pPr>
+        <w:pStyle w:val="ExamBody"/>
+      </w:pPr>
+      <w:r>
+        <w:t>Grußformel und dein Name stehen am Ende.</w:t>
+      </w:r>
+    </w:p>
+    <w:p>
+      <w:pPr>
+        <w:pStyle w:val="ExamBody"/>
+      </w:pPr>
+      <w:r>
+        <w:t>☐ gelungen   ☐ noch üben</w:t>
+      </w:r>
+    </w:p>
+    <w:p>
+      <w:pPr>
+        <w:pStyle w:val="ExamBody"/>
+      </w:pPr>
+      <w:r>
+        <w:t>Dein Brief ist freundlich.</w:t>
+      </w:r>
+    </w:p>
+    <w:p>
+      <w:pPr>
+        <w:pStyle w:val="ExamBody"/>
+      </w:pPr>
+      <w:r>
+        <w:t>☐ gelungen   ☐ noch üben</w:t>
+      </w:r>
+    </w:p>
+    <w:p>
+      <w:pPr>
+        <w:pStyle w:val="ExamBody"/>
+      </w:pPr>
+      <w:r>
+        <w:t>Du schreibst verständliche Sätze und lesbar.</w:t>
+      </w:r>
+    </w:p>
+    <w:p>
+      <w:pPr>
+        <w:pStyle w:val="ExamBody"/>
+      </w:pPr>
+      <w:r>
+        <w:t>☐ gelungen   ☐ noch üben</w:t>
+      </w:r>
+    </w:p>
+    <w:p>
+      <w:pPr>
+        <w:pStyle w:val="ExamBody"/>
+      </w:pPr>
+      <w:r>
+        <w:t>Ort und Datum: ☐ vorhanden   ☐ noch ergänzen</w:t>
+      </w:r>
+    </w:p>
+    <w:p>
+      <w:pPr>
+        <w:pStyle w:val="ExamHeading"/>
+      </w:pPr>
+      <w:r>
+        <w:t>Freiwillige Zusätze</w:t>
+      </w:r>
+    </w:p>
+    <w:p>
+      <w:pPr>
+        <w:pStyle w:val="ExamBody"/>
+      </w:pPr>
+      <w:r>
+        <w:t>Grund: ☐ passend  ☐ noch prüfen  ☐ nicht genutzt</w:t>
+        <w:br/>
+        <w:t>Daten: ☐ passend  ☐ noch prüfen  ☐ nicht genutzt</w:t>
+      </w:r>
+    </w:p>
+    <w:p>
+      <w:pPr>
+        <w:pStyle w:val="ExamLabel"/>
+      </w:pPr>
+      <w:r>
+        <w:t>Diese zusätzliche Hilfe gab es (oder: keine):</w:t>
+      </w:r>
+    </w:p>
+    <w:p>
+      <w:pPr>
+        <w:pStyle w:val="ExamBody"/>
+        <w:spacing w:after="0" w:line="440" w:lineRule="exact"/>
+        <w:pBdr>
+          <w:bottom w:val="single" w:sz="3" w:color="B2B8BC"/>
+          <w:between w:val="single" w:sz="3" w:color="B2B8BC"/>
+        </w:pBdr>
+      </w:pPr>
+      <w:r>
+        <w:rPr>
+          <w:sz w:val="2"/>
+        </w:rPr>
+        <w:t xml:space="preserve"> </w:t>
+      </w:r>
+    </w:p>
+    <w:p>
+      <w:pPr>
+        <w:pStyle w:val="ExamLabel"/>
+      </w:pPr>
+      <w:r>
+        <w:t>Das gelingt dir schon:</w:t>
+      </w:r>
+    </w:p>
+    <w:p>
+      <w:pPr>
+        <w:pStyle w:val="ExamBody"/>
+        <w:spacing w:after="0" w:line="440" w:lineRule="exact"/>
+        <w:pBdr>
+          <w:bottom w:val="single" w:sz="3" w:color="B2B8BC"/>
+          <w:between w:val="single" w:sz="3" w:color="B2B8BC"/>
+        </w:pBdr>
+      </w:pPr>
+      <w:r>
+        <w:rPr>
+          <w:sz w:val="2"/>
+        </w:rPr>
+        <w:t xml:space="preserve"> </w:t>
+      </w:r>
+    </w:p>
+    <w:p>
+      <w:pPr>
+        <w:pStyle w:val="ExamLabel"/>
+      </w:pPr>
+      <w:r>
+        <w:t>Dein nächster Schritt / passendes Blatt:</w:t>
+      </w:r>
+    </w:p>
+    <w:p>
+      <w:pPr>
+        <w:pStyle w:val="ExamBody"/>
+        <w:spacing w:after="0" w:line="440" w:lineRule="exact"/>
+        <w:pBdr>
+          <w:bottom w:val="single" w:sz="3" w:color="B2B8BC"/>
+          <w:between w:val="single" w:sz="3" w:color="B2B8BC"/>
+        </w:pBdr>
+      </w:pPr>
+      <w:r>
+        <w:rPr>
+          <w:sz w:val="2"/>
+        </w:rPr>
+        <w:t xml:space="preserve"> </w:t>
+      </w:r>
+    </w:p>
+    <w:p>
+      <w:pPr>
+        <w:pStyle w:val="ExamBody"/>
+      </w:pPr>
+      <w:r>
+        <w:t>Terminwahl: ☐ besprechen   ☐ nach gezielter Übung besprechen</w:t>
+      </w:r>
     </w:p>
     <w:sectPr>
+      <w:headerReference w:type="default" r:id="rId9"/>
+      <w:footerReference w:type="default" r:id="rId10"/>
       <w:pgSz w:w="11906" w:h="16838"/>
-      <w:pgMar w:top="765" w:right="879" w:bottom="709" w:left="879" w:header="720" w:footer="720" w:gutter="0"/>
+      <w:pgMar w:top="850" w:right="907" w:bottom="850" w:left="907" w:header="720" w:footer="720" w:gutter="0"/>
       <w:cols w:space="720"/>
       <w:docGrid w:linePitch="360"/>
     </w:sectPr>
   </w:body>
 </w:document>
+</file>
+
+<file path=word/footer1.xml><?xml version="1.0" encoding="utf-8"?>
+<w:ftr xmlns:m="http://schemas.openxmlformats.org/officeDocument/2006/math" xmlns:mc="http://schemas.openxmlformats.org/markup-compatibility/2006" xmlns:mo="http://schemas.microsoft.com/office/mac/office/2008/main" xmlns:mv="urn:schemas-microsoft-com:mac:vml" xmlns:o="urn:schemas-microsoft-com:office:office" xmlns:r="http://schemas.openxmlformats.org/officeDocument/2006/relationships" xmlns:v="urn:schemas-microsoft-com:vml" xmlns:w10="urn:schemas-microsoft-com:office:word" xmlns:w14="http://schemas.microsoft.com/office/word/2010/wordml" xmlns:w="http://schemas.openxmlformats.org/wordprocessingml/2006/main" xmlns:wne="http://schemas.microsoft.com/office/word/2006/wordml" xmlns:wp14="http://schemas.microsoft.com/office/word/2010/wordprocessingDrawing" xmlns:wp="http://schemas.openxmlformats.org/drawingml/2006/wordprocessingDrawing" xmlns:wpc="http://schemas.microsoft.com/office/word/2010/wordprocessingCanvas" xmlns:wpg="http://schemas.microsoft.com/office/word/2010/wordprocessingGroup" xmlns:wpi="http://schemas.microsoft.com/office/word/2010/wordprocessingInk" xmlns:wps="http://schemas.microsoft.com/office/word/2010/wordprocessingShape" mc:Ignorable="w14 wp14">
+  <w:p>
+    <w:pPr>
+      <w:pStyle w:val="Footer"/>
+    </w:pPr>
+    <w:r>
+      <w:rPr>
+        <w:rFonts w:ascii="Arial" w:hAnsi="Arial"/>
+        <w:sz w:val="18"/>
+      </w:rPr>
+      <w:t xml:space="preserve">Deutsch 5 · Wunschbriefe · 8. September 2026 · Fassung 3  |  </w:t>
+    </w:r>
+    <w:fldSimple w:instr="PAGE"/>
+  </w:p>
+</w:ftr>
+</file>
+
+<file path=word/header1.xml><?xml version="1.0" encoding="utf-8"?>
+<w:hdr xmlns:m="http://schemas.openxmlformats.org/officeDocument/2006/math" xmlns:mc="http://schemas.openxmlformats.org/markup-compatibility/2006" xmlns:mo="http://schemas.microsoft.com/office/mac/office/2008/main" xmlns:mv="urn:schemas-microsoft-com:mac:vml" xmlns:o="urn:schemas-microsoft-com:office:office" xmlns:r="http://schemas.openxmlformats.org/officeDocument/2006/relationships" xmlns:v="urn:schemas-microsoft-com:vml" xmlns:w10="urn:schemas-microsoft-com:office:word" xmlns:w14="http://schemas.microsoft.com/office/word/2010/wordml" xmlns:w="http://schemas.openxmlformats.org/wordprocessingml/2006/main" xmlns:wne="http://schemas.microsoft.com/office/word/2006/wordml" xmlns:wp14="http://schemas.microsoft.com/office/word/2010/wordprocessingDrawing" xmlns:wp="http://schemas.openxmlformats.org/drawingml/2006/wordprocessingDrawing" xmlns:wpc="http://schemas.microsoft.com/office/word/2010/wordprocessingCanvas" xmlns:wpg="http://schemas.microsoft.com/office/word/2010/wordprocessingGroup" xmlns:wpi="http://schemas.microsoft.com/office/word/2010/wordprocessingInk" xmlns:wps="http://schemas.microsoft.com/office/word/2010/wordprocessingShape" mc:Ignorable="w14 wp14">
+  <w:p>
+    <w:pPr>
+      <w:pStyle w:val="Header"/>
+    </w:pPr>
+  </w:p>
+</w:hdr>
 </file>
 
 <file path=word/numbering.xml><?xml version="1.0" encoding="utf-8"?>
@@ -2358,9 +2079,14 @@
     <w:name w:val="Normal"/>
     <w:qFormat/>
     <w:rsid w:val="00FC693F"/>
+    <w:pPr>
+      <w:keepNext w:val="0"/>
+      <w:spacing w:after="120" w:before="0" w:line="259" w:lineRule="auto"/>
+    </w:pPr>
     <w:rPr>
-      <w:rFonts w:ascii="Aptos" w:hAnsi="Aptos" w:eastAsia="Aptos"/>
-      <w:sz w:val="20"/>
+      <w:rFonts w:ascii="Arial" w:hAnsi="Arial" w:eastAsia="Aptos"/>
+      <w:color w:val="24313A"/>
+      <w:sz w:val="28"/>
     </w:rPr>
   </w:style>
   <w:style w:type="paragraph" w:styleId="Header">
@@ -2418,15 +2144,15 @@
     <w:pPr>
       <w:keepNext/>
       <w:keepLines/>
-      <w:spacing w:before="480" w:after="0"/>
+      <w:spacing w:before="160" w:after="120" w:line="259" w:lineRule="auto"/>
       <w:outlineLvl w:val="0"/>
     </w:pPr>
     <w:rPr>
-      <w:rFonts w:asciiTheme="majorHAnsi" w:eastAsiaTheme="majorEastAsia" w:hAnsiTheme="majorHAnsi" w:cstheme="majorBidi" w:ascii="Aptos Display" w:hAnsi="Aptos Display" w:eastAsia="Aptos Display"/>
+      <w:rFonts w:asciiTheme="majorHAnsi" w:eastAsiaTheme="majorEastAsia" w:hAnsiTheme="majorHAnsi" w:cstheme="majorBidi" w:ascii="Arial" w:hAnsi="Arial" w:eastAsia="Aptos Display"/>
       <w:b/>
       <w:bCs/>
       <w:color w:val="3E5668"/>
-      <w:sz w:val="31"/>
+      <w:sz w:val="36"/>
       <w:szCs w:val="28"/>
     </w:rPr>
   </w:style>
@@ -2442,15 +2168,15 @@
     <w:pPr>
       <w:keepNext/>
       <w:keepLines/>
-      <w:spacing w:before="200" w:after="0"/>
+      <w:spacing w:before="160" w:after="120" w:line="259" w:lineRule="auto"/>
       <w:outlineLvl w:val="1"/>
     </w:pPr>
     <w:rPr>
-      <w:rFonts w:asciiTheme="majorHAnsi" w:eastAsiaTheme="majorEastAsia" w:hAnsiTheme="majorHAnsi" w:cstheme="majorBidi" w:ascii="Aptos Display" w:hAnsi="Aptos Display" w:eastAsia="Aptos Display"/>
+      <w:rFonts w:asciiTheme="majorHAnsi" w:eastAsiaTheme="majorEastAsia" w:hAnsiTheme="majorHAnsi" w:cstheme="majorBidi" w:ascii="Arial" w:hAnsi="Arial" w:eastAsia="Aptos Display"/>
       <w:b/>
       <w:bCs/>
-      <w:color w:val="D97A4A"/>
-      <w:sz w:val="25"/>
+      <w:color w:val="3E5668"/>
+      <w:sz w:val="28"/>
       <w:szCs w:val="26"/>
     </w:rPr>
   </w:style>
@@ -2707,16 +2433,16 @@
       <w:pBdr>
         <w:bottom w:val="single" w:sz="8" w:space="4" w:color="4F81BD" w:themeColor="accent1"/>
       </w:pBdr>
-      <w:spacing w:after="300" w:line="240" w:lineRule="auto"/>
+      <w:spacing w:after="120" w:line="259" w:lineRule="auto" w:before="160"/>
       <w:contextualSpacing/>
     </w:pPr>
     <w:rPr>
-      <w:rFonts w:asciiTheme="majorHAnsi" w:eastAsiaTheme="majorEastAsia" w:hAnsiTheme="majorHAnsi" w:cstheme="majorBidi" w:ascii="Aptos Display" w:hAnsi="Aptos Display" w:eastAsia="Aptos Display"/>
+      <w:rFonts w:asciiTheme="majorHAnsi" w:eastAsiaTheme="majorEastAsia" w:hAnsiTheme="majorHAnsi" w:cstheme="majorBidi" w:ascii="Arial" w:hAnsi="Arial" w:eastAsia="Aptos Display"/>
       <w:b/>
       <w:color w:val="3E5668"/>
       <w:spacing w:val="5"/>
       <w:kern w:val="28"/>
-      <w:sz w:val="42"/>
+      <w:sz w:val="48"/>
       <w:szCs w:val="52"/>
     </w:rPr>
   </w:style>
@@ -14045,6 +13771,58 @@
         <w:shd w:val="clear" w:color="auto" w:fill="FBCAA2" w:themeFill="accent6" w:themeFillTint="7F"/>
       </w:tcPr>
     </w:tblStylePr>
+  </w:style>
+  <w:style w:type="paragraph" w:customStyle="1" w:styleId="ExamBody">
+    <w:name w:val="ExamBody"/>
+    <w:pPr>
+      <w:keepNext w:val="0"/>
+      <w:spacing w:before="0" w:after="140" w:line="247" w:lineRule="auto"/>
+    </w:pPr>
+    <w:rPr>
+      <w:rFonts w:ascii="Arial" w:hAnsi="Arial"/>
+      <w:b w:val="0"/>
+      <w:color w:val="24313A"/>
+      <w:sz w:val="28"/>
+    </w:rPr>
+  </w:style>
+  <w:style w:type="paragraph" w:customStyle="1" w:styleId="ExamTitle">
+    <w:name w:val="ExamTitle"/>
+    <w:pPr>
+      <w:keepNext/>
+      <w:spacing w:before="0" w:after="140" w:line="247" w:lineRule="auto"/>
+    </w:pPr>
+    <w:rPr>
+      <w:rFonts w:ascii="Arial" w:hAnsi="Arial"/>
+      <w:b/>
+      <w:color w:val="24313A"/>
+      <w:sz w:val="44"/>
+    </w:rPr>
+  </w:style>
+  <w:style w:type="paragraph" w:customStyle="1" w:styleId="ExamHeading">
+    <w:name w:val="ExamHeading"/>
+    <w:pPr>
+      <w:keepNext/>
+      <w:spacing w:before="0" w:after="140" w:line="247" w:lineRule="auto"/>
+    </w:pPr>
+    <w:rPr>
+      <w:rFonts w:ascii="Arial" w:hAnsi="Arial"/>
+      <w:b/>
+      <w:color w:val="24313A"/>
+      <w:sz w:val="32"/>
+    </w:rPr>
+  </w:style>
+  <w:style w:type="paragraph" w:customStyle="1" w:styleId="ExamLabel">
+    <w:name w:val="ExamLabel"/>
+    <w:pPr>
+      <w:keepNext/>
+      <w:spacing w:before="0" w:after="140" w:line="247" w:lineRule="auto"/>
+    </w:pPr>
+    <w:rPr>
+      <w:rFonts w:ascii="Arial" w:hAnsi="Arial"/>
+      <w:b/>
+      <w:color w:val="24313A"/>
+      <w:sz w:val="28"/>
+    </w:rPr>
   </w:style>
 </w:styles>
 </file>

</xml_diff>